<commit_message>
Added code, and report content-about to finalize
</commit_message>
<xml_diff>
--- a/15/Document1_FINAL.docx
+++ b/15/Document1_FINAL.docx
@@ -375,7 +375,7 @@
         <w:rPr>
           <w:highlight w:val="none"/>
         </w:rPr>
-        <w:t xml:space="preserve">This was solved by grouping all rows under the condition their  ASIN numbers are the same. There for as for the ASIN column, we have a value, based on the characteristic of the different column, averages were calculated, sum-count was calculated, as for the natural lang data, words were concatenated. </w:t>
+        <w:t xml:space="preserve">This was solved by Data intergration  grouping all rows under the condition their  ASIN numbers are the same. There for as for the ASIN column, we have a value, based on the characteristic of the different column, averages were calculated, sum-count was calculated, as for the natural lang data, words were concatenated. </w:t>
       </w:r>
       <w:r>
         <w:rPr>
@@ -391,7 +391,163 @@
     <w:p>
       <w:pPr>
         <w:pBdr/>
-        <w:shd w:val="nil"/>
+        <w:spacing/>
+        <w:ind/>
+        <w:rPr>
+          <w:highlight w:val="none"/>
+        </w:rPr>
+      </w:pPr>
+      <w:r>
+        <w:rPr>
+          <w:highlight w:val="none"/>
+        </w:rPr>
+        <w:t xml:space="preserve">Other pre-preocessing processes include</w:t>
+      </w:r>
+      <w:r>
+        <w:rPr>
+          <w:highlight w:val="none"/>
+        </w:rPr>
+      </w:r>
+    </w:p>
+    <w:p>
+      <w:pPr>
+        <w:pBdr/>
+        <w:spacing/>
+        <w:ind/>
+        <w:rPr>
+          <w:highlight w:val="none"/>
+        </w:rPr>
+      </w:pPr>
+      <w:r>
+        <w:rPr>
+          <w:highlight w:val="none"/>
+        </w:rPr>
+      </w:r>
+      <w:r>
+        <w:rPr>
+          <w:highlight w:val="none"/>
+        </w:rPr>
+      </w:r>
+      <w:r>
+        <w:rPr>
+          <w:highlight w:val="none"/>
+        </w:rPr>
+      </w:r>
+    </w:p>
+    <w:p>
+      <w:pPr>
+        <w:pBdr/>
+        <w:spacing/>
+        <w:ind/>
+        <w:rPr>
+          <w:highlight w:val="none"/>
+        </w:rPr>
+      </w:pPr>
+      <w:r>
+        <w:rPr>
+          <w:highlight w:val="none"/>
+        </w:rPr>
+        <w:t xml:space="preserve"> Data splitting, </w:t>
+      </w:r>
+      <w:r>
+        <w:rPr>
+          <w:highlight w:val="none"/>
+        </w:rPr>
+      </w:r>
+    </w:p>
+    <w:p>
+      <w:pPr>
+        <w:pBdr/>
+        <w:spacing/>
+        <w:ind/>
+        <w:rPr>
+          <w:highlight w:val="none"/>
+        </w:rPr>
+      </w:pPr>
+      <w:r>
+        <w:rPr>
+          <w:highlight w:val="none"/>
+        </w:rPr>
+      </w:r>
+      <w:r>
+        <w:rPr>
+          <w:highlight w:val="none"/>
+        </w:rPr>
+      </w:r>
+      <w:r>
+        <w:rPr>
+          <w:highlight w:val="none"/>
+        </w:rPr>
+      </w:r>
+    </w:p>
+    <w:p>
+      <w:pPr>
+        <w:pBdr/>
+        <w:spacing/>
+        <w:ind/>
+        <w:rPr>
+          <w:highlight w:val="none"/>
+        </w:rPr>
+      </w:pPr>
+      <w:r>
+        <w:rPr>
+          <w:highlight w:val="none"/>
+        </w:rPr>
+        <w:t xml:space="preserve">Data Transformation, </w:t>
+      </w:r>
+      <w:r>
+        <w:rPr>
+          <w:highlight w:val="none"/>
+        </w:rPr>
+      </w:r>
+    </w:p>
+    <w:p>
+      <w:pPr>
+        <w:pBdr/>
+        <w:spacing/>
+        <w:ind/>
+        <w:rPr>
+          <w:highlight w:val="none"/>
+        </w:rPr>
+      </w:pPr>
+      <w:r>
+        <w:rPr>
+          <w:highlight w:val="none"/>
+        </w:rPr>
+      </w:r>
+      <w:r>
+        <w:rPr>
+          <w:highlight w:val="none"/>
+        </w:rPr>
+      </w:r>
+      <w:r>
+        <w:rPr>
+          <w:highlight w:val="none"/>
+        </w:rPr>
+      </w:r>
+    </w:p>
+    <w:p>
+      <w:pPr>
+        <w:pBdr/>
+        <w:spacing/>
+        <w:ind/>
+        <w:rPr>
+          <w:highlight w:val="none"/>
+        </w:rPr>
+      </w:pPr>
+      <w:r>
+        <w:rPr>
+          <w:highlight w:val="none"/>
+        </w:rPr>
+        <w:t xml:space="preserve">Standardization and Converting non-numerical features</w:t>
+      </w:r>
+      <w:r/>
+      <w:r/>
+    </w:p>
+    <w:p>
+      <w:pPr>
+        <w:pBdr/>
+        <w:shd w:val="nil" w:color="000000"/>
         <w:spacing/>
         <w:ind/>
         <w:rPr>
@@ -416,11 +572,21 @@
           <w:u w:val="none"/>
           <w:lang w:val="en-US"/>
         </w:rPr>
-        <w:t xml:space="preserve">Data Splitting: Partitioning datasets securely into training, validation, and test subsets to guarantee</w:t>
+        <w:t xml:space="preserve">Data Splitting: Partitioning datasets securely into training, validation, and test subsets to guarantee-</w:t>
       </w:r>
       <w:r>
         <w:rPr>
-          <w:rFonts w:ascii="Arial" w:hAnsi="Arial" w:cs="Arial"/>
+          <w:highlight w:val="none"/>
+        </w:rPr>
+      </w:r>
+      <w:r>
+        <w:rPr>
+          <w:highlight w:val="none"/>
+        </w:rPr>
+      </w:r>
+      <w:r>
+        <w:rPr>
+          <w:rFonts w:ascii="Arial" w:hAnsi="Arial" w:eastAsia="Arial" w:cs="Arial"/>
           <w:b w:val="0"/>
           <w:i w:val="0"/>
           <w:caps w:val="0"/>
@@ -428,11 +594,35 @@
           <w:strike w:val="0"/>
           <w:color w:val="000000" w:themeColor="text1"/>
           <w:spacing w:val="0"/>
-          <w:sz w:val="38"/>
-          <w:szCs w:val="38"/>
           <w:u w:val="none"/>
           <w:lang w:val="en-US"/>
         </w:rPr>
+        <w:t xml:space="preserve">generalization capability while strictly fitting scaling objects to the training subset only.-</w:t>
+      </w:r>
+      <w:r>
+        <w:rPr>
+          <w:highlight w:val="none"/>
+        </w:rPr>
+      </w:r>
+      <w:r>
+        <w:rPr>
+          <w:highlight w:val="none"/>
+        </w:rPr>
+      </w:r>
+      <w:r>
+        <w:rPr>
+          <w:rFonts w:ascii="Arial" w:hAnsi="Arial" w:eastAsia="Arial" w:cs="Arial"/>
+          <w:b w:val="0"/>
+          <w:i w:val="0"/>
+          <w:caps w:val="0"/>
+          <w:smallCaps w:val="0"/>
+          <w:strike w:val="0"/>
+          <w:color w:val="000000" w:themeColor="text1"/>
+          <w:spacing w:val="0"/>
+          <w:u w:val="none"/>
+          <w:lang w:val="en-US"/>
+        </w:rPr>
+        <w:t xml:space="preserve">Data Transformation: Standardizing the data format via numerical scaling (Min-Max scaling, Z-score </w:t>
       </w:r>
       <w:r>
         <w:rPr>
@@ -456,16 +646,6 @@
           <w:highlight w:val="none"/>
         </w:rPr>
       </w:r>
-    </w:p>
-    <w:p>
-      <w:pPr>
-        <w:pBdr/>
-        <w:spacing/>
-        <w:ind/>
-        <w:rPr>
-          <w:highlight w:val="none"/>
-        </w:rPr>
-      </w:pPr>
       <w:r>
         <w:rPr>
           <w:rFonts w:ascii="Arial" w:hAnsi="Arial" w:eastAsia="Arial" w:cs="Arial"/>
@@ -479,531 +659,13 @@
           <w:u w:val="none"/>
           <w:lang w:val="en-US"/>
         </w:rPr>
-        <w:t xml:space="preserve">generalization capability while strictly fitting scaling objects to the training subset only.</w:t>
-      </w:r>
-      <w:r/>
-      <w:r/>
-      <w:r>
-        <w:rPr>
-          <w:highlight w:val="none"/>
-        </w:rPr>
-      </w:r>
-      <w:r>
-        <w:rPr>
-          <w:highlight w:val="none"/>
-        </w:rPr>
-      </w:r>
-      <w:r>
-        <w:rPr>
-          <w:highlight w:val="none"/>
-        </w:rPr>
-      </w:r>
-    </w:p>
-    <w:p>
-      <w:pPr>
-        <w:pBdr/>
-        <w:spacing/>
-        <w:ind/>
-        <w:rPr>
-          <w:rFonts w:ascii="Arial" w:hAnsi="Arial" w:cs="Arial"/>
-          <w:b w:val="0"/>
-          <w:bCs w:val="0"/>
-          <w:i w:val="0"/>
-          <w:caps w:val="0"/>
-          <w:smallCaps w:val="0"/>
-          <w:strike w:val="0"/>
-          <w:color w:val="000000" w:themeColor="text1"/>
-          <w:spacing w:val="0"/>
-          <w:sz w:val="38"/>
-          <w:szCs w:val="38"/>
-          <w:u w:val="none"/>
-          <w:lang w:val="en-US"/>
-        </w:rPr>
-      </w:pPr>
-      <w:r>
-        <w:rPr>
-          <w:rFonts w:ascii="Arial" w:hAnsi="Arial" w:eastAsia="Arial" w:cs="Arial"/>
-          <w:b w:val="0"/>
-          <w:i w:val="0"/>
-          <w:caps w:val="0"/>
-          <w:smallCaps w:val="0"/>
-          <w:strike w:val="0"/>
-          <w:color w:val="000000" w:themeColor="text1"/>
-          <w:spacing w:val="0"/>
-          <w:u w:val="none"/>
-          <w:lang w:val="en-US"/>
-        </w:rPr>
-        <w:t xml:space="preserve">Data Transformation: Standardizing the data format via numerical scaling (Min-Max scaling, Z-score</w:t>
-      </w:r>
-      <w:r>
-        <w:rPr>
-          <w:rFonts w:ascii="Arial" w:hAnsi="Arial" w:cs="Arial"/>
-          <w:b w:val="0"/>
-          <w:i w:val="0"/>
-          <w:caps w:val="0"/>
-          <w:smallCaps w:val="0"/>
-          <w:strike w:val="0"/>
-          <w:color w:val="000000" w:themeColor="text1"/>
-          <w:spacing w:val="0"/>
-          <w:sz w:val="38"/>
-          <w:szCs w:val="38"/>
-          <w:u w:val="none"/>
-          <w:lang w:val="en-US"/>
-        </w:rPr>
+        <w:t xml:space="preserve">standardization, Log transforms) and converting non-numerical features (One-Hot, Ordinal, or Target </w:t>
       </w:r>
       <w:r>
         <w:rPr>
           <w:rFonts w:ascii="Arial" w:hAnsi="Arial" w:cs="Arial"/>
           <w:b w:val="0"/>
           <w:bCs w:val="0"/>
-          <w:i w:val="0"/>
-          <w:caps w:val="0"/>
-          <w:smallCaps w:val="0"/>
-          <w:strike w:val="0"/>
-          <w:color w:val="000000" w:themeColor="text1"/>
-          <w:spacing w:val="0"/>
-          <w:sz w:val="38"/>
-          <w:szCs w:val="38"/>
-          <w:u w:val="none"/>
-          <w:lang w:val="en-US"/>
-        </w:rPr>
-      </w:r>
-    </w:p>
-    <w:p>
-      <w:pPr>
-        <w:pBdr/>
-        <w:spacing/>
-        <w:ind/>
-        <w:rPr>
-          <w:rFonts w:ascii="Arial" w:hAnsi="Arial" w:cs="Arial"/>
-          <w:b w:val="0"/>
-          <w:bCs w:val="0"/>
-          <w:i w:val="0"/>
-          <w:caps w:val="0"/>
-          <w:smallCaps w:val="0"/>
-          <w:strike w:val="0"/>
-          <w:color w:val="000000" w:themeColor="text1"/>
-          <w:spacing w:val="0"/>
-          <w:sz w:val="38"/>
-          <w:szCs w:val="38"/>
-          <w:u w:val="none"/>
-          <w:lang w:val="en-US"/>
-        </w:rPr>
-      </w:pPr>
-      <w:r>
-        <w:rPr>
-          <w:rFonts w:ascii="Arial" w:hAnsi="Arial" w:eastAsia="Arial" w:cs="Arial"/>
-          <w:b w:val="0"/>
-          <w:i w:val="0"/>
-          <w:caps w:val="0"/>
-          <w:smallCaps w:val="0"/>
-          <w:strike w:val="0"/>
-          <w:color w:val="000000" w:themeColor="text1"/>
-          <w:spacing w:val="0"/>
-          <w:u w:val="none"/>
-          <w:lang w:val="en-US"/>
-        </w:rPr>
-        <w:t xml:space="preserve">standardization, Log transforms) and converting non-numerical features (One-Hot, Ordinal, or Target</w:t>
-      </w:r>
-      <w:r>
-        <w:rPr>
-          <w:rFonts w:ascii="Arial" w:hAnsi="Arial" w:cs="Arial"/>
-          <w:b w:val="0"/>
-          <w:i w:val="0"/>
-          <w:caps w:val="0"/>
-          <w:smallCaps w:val="0"/>
-          <w:strike w:val="0"/>
-          <w:color w:val="000000" w:themeColor="text1"/>
-          <w:spacing w:val="0"/>
-          <w:sz w:val="38"/>
-          <w:szCs w:val="38"/>
-          <w:u w:val="none"/>
-          <w:lang w:val="en-US"/>
-        </w:rPr>
-      </w:r>
-      <w:r>
-        <w:rPr>
-          <w:rFonts w:ascii="Arial" w:hAnsi="Arial" w:cs="Arial"/>
-          <w:b w:val="0"/>
-          <w:bCs w:val="0"/>
-          <w:i w:val="0"/>
-          <w:caps w:val="0"/>
-          <w:smallCaps w:val="0"/>
-          <w:strike w:val="0"/>
-          <w:color w:val="000000" w:themeColor="text1"/>
-          <w:spacing w:val="0"/>
-          <w:sz w:val="38"/>
-          <w:szCs w:val="38"/>
-          <w:u w:val="none"/>
-          <w:lang w:val="en-US"/>
-        </w:rPr>
-      </w:r>
-    </w:p>
-    <w:p>
-      <w:pPr>
-        <w:pBdr/>
-        <w:spacing/>
-        <w:ind/>
-        <w:rPr>
-          <w:highlight w:val="none"/>
-        </w:rPr>
-      </w:pPr>
-      <w:r>
-        <w:rPr>
-          <w:rFonts w:ascii="Arial" w:hAnsi="Arial" w:eastAsia="Arial" w:cs="Arial"/>
-          <w:b w:val="0"/>
-          <w:i w:val="0"/>
-          <w:caps w:val="0"/>
-          <w:smallCaps w:val="0"/>
-          <w:strike w:val="0"/>
-          <w:color w:val="000000" w:themeColor="text1"/>
-          <w:spacing w:val="0"/>
-          <w:u w:val="none"/>
-          <w:lang w:val="en-US"/>
-        </w:rPr>
-        <w:t xml:space="preserve">encoding).</w:t>
-      </w:r>
-      <w:r>
-        <w:rPr>
-          <w:rFonts w:ascii="Arial" w:hAnsi="Arial" w:cs="Arial"/>
-          <w:b w:val="0"/>
-          <w:i w:val="0"/>
-          <w:caps w:val="0"/>
-          <w:smallCaps w:val="0"/>
-          <w:strike w:val="0"/>
-          <w:color w:val="000000" w:themeColor="text1"/>
-          <w:spacing w:val="0"/>
-          <w:sz w:val="38"/>
-          <w:szCs w:val="38"/>
-          <w:u w:val="none"/>
-          <w:lang w:val="en-US"/>
-        </w:rPr>
-      </w:r>
-      <w:r>
-        <w:rPr>
-          <w:rFonts w:ascii="Arial" w:hAnsi="Arial" w:cs="Arial"/>
-          <w:b w:val="0"/>
-          <w:bCs w:val="0"/>
-          <w:i w:val="0"/>
-          <w:caps w:val="0"/>
-          <w:smallCaps w:val="0"/>
-          <w:strike w:val="0"/>
-          <w:color w:val="000000" w:themeColor="text1"/>
-          <w:spacing w:val="0"/>
-          <w:sz w:val="38"/>
-          <w:szCs w:val="38"/>
-          <w:u w:val="none"/>
-          <w:lang w:val="en-US"/>
-        </w:rPr>
-      </w:r>
-      <w:r>
-        <w:rPr>
-          <w:highlight w:val="none"/>
-        </w:rPr>
-      </w:r>
-    </w:p>
-    <w:p>
-      <w:pPr>
-        <w:pBdr/>
-        <w:spacing/>
-        <w:ind/>
-        <w:rPr>
-          <w:rFonts w:ascii="Arial" w:hAnsi="Arial" w:cs="Arial"/>
-          <w:b w:val="0"/>
-          <w:bCs w:val="0"/>
-          <w:i w:val="0"/>
-          <w:caps w:val="0"/>
-          <w:smallCaps w:val="0"/>
-          <w:strike w:val="0"/>
-          <w:color w:val="000000" w:themeColor="text1"/>
-          <w:spacing w:val="0"/>
-          <w:sz w:val="38"/>
-          <w:szCs w:val="38"/>
-          <w:u w:val="none"/>
-          <w:lang w:val="en-US"/>
-        </w:rPr>
-      </w:pPr>
-      <w:r>
-        <w:rPr>
-          <w:rFonts w:ascii="Arial" w:hAnsi="Arial" w:eastAsia="Arial" w:cs="Arial"/>
-          <w:b w:val="0"/>
-          <w:i w:val="0"/>
-          <w:caps w:val="0"/>
-          <w:smallCaps w:val="0"/>
-          <w:strike w:val="0"/>
-          <w:color w:val="000000" w:themeColor="text1"/>
-          <w:spacing w:val="0"/>
-          <w:u w:val="none"/>
-          <w:lang w:val="en-US"/>
-        </w:rPr>
-        <w:t xml:space="preserve">Data Cleaning: Addressing structural issues by handling missing values (via deletion, statistical imputation</w:t>
-      </w:r>
-      <w:r>
-        <w:rPr>
-          <w:rFonts w:ascii="Arial" w:hAnsi="Arial" w:cs="Arial"/>
-          <w:b w:val="0"/>
-          <w:i w:val="0"/>
-          <w:caps w:val="0"/>
-          <w:smallCaps w:val="0"/>
-          <w:strike w:val="0"/>
-          <w:color w:val="000000" w:themeColor="text1"/>
-          <w:spacing w:val="0"/>
-          <w:sz w:val="38"/>
-          <w:szCs w:val="38"/>
-          <w:u w:val="none"/>
-          <w:lang w:val="en-US"/>
-        </w:rPr>
-      </w:r>
-      <w:r>
-        <w:rPr>
-          <w:rFonts w:ascii="Arial" w:hAnsi="Arial" w:cs="Arial"/>
-          <w:b w:val="0"/>
-          <w:bCs w:val="0"/>
-          <w:i w:val="0"/>
-          <w:caps w:val="0"/>
-          <w:smallCaps w:val="0"/>
-          <w:strike w:val="0"/>
-          <w:color w:val="000000" w:themeColor="text1"/>
-          <w:spacing w:val="0"/>
-          <w:sz w:val="38"/>
-          <w:szCs w:val="38"/>
-          <w:u w:val="none"/>
-          <w:lang w:val="en-US"/>
-        </w:rPr>
-      </w:r>
-    </w:p>
-    <w:p>
-      <w:pPr>
-        <w:pBdr/>
-        <w:spacing/>
-        <w:ind/>
-        <w:rPr>
-          <w:rFonts w:ascii="Arial" w:hAnsi="Arial" w:cs="Arial"/>
-          <w:b w:val="0"/>
-          <w:bCs w:val="0"/>
-          <w:i w:val="0"/>
-          <w:caps w:val="0"/>
-          <w:smallCaps w:val="0"/>
-          <w:strike w:val="0"/>
-          <w:color w:val="000000" w:themeColor="text1"/>
-          <w:spacing w:val="0"/>
-          <w:sz w:val="38"/>
-          <w:szCs w:val="38"/>
-          <w:u w:val="none"/>
-          <w:lang w:val="en-US"/>
-        </w:rPr>
-      </w:pPr>
-      <w:r>
-        <w:rPr>
-          <w:rFonts w:ascii="Arial" w:hAnsi="Arial" w:eastAsia="Arial" w:cs="Arial"/>
-          <w:b w:val="0"/>
-          <w:i w:val="0"/>
-          <w:caps w:val="0"/>
-          <w:smallCaps w:val="0"/>
-          <w:strike w:val="0"/>
-          <w:color w:val="000000" w:themeColor="text1"/>
-          <w:spacing w:val="0"/>
-          <w:u w:val="none"/>
-          <w:lang w:val="en-US"/>
-        </w:rPr>
-        <w:t xml:space="preserve">like mean/median/mode, or advanced algorithms like k-NN and autoencoders) and neutralizing outliers</w:t>
-      </w:r>
-      <w:r>
-        <w:rPr>
-          <w:rFonts w:ascii="Arial" w:hAnsi="Arial" w:cs="Arial"/>
-          <w:b w:val="0"/>
-          <w:i w:val="0"/>
-          <w:caps w:val="0"/>
-          <w:smallCaps w:val="0"/>
-          <w:strike w:val="0"/>
-          <w:color w:val="000000" w:themeColor="text1"/>
-          <w:spacing w:val="0"/>
-          <w:sz w:val="38"/>
-          <w:szCs w:val="38"/>
-          <w:u w:val="none"/>
-          <w:lang w:val="en-US"/>
-        </w:rPr>
-      </w:r>
-      <w:r>
-        <w:rPr>
-          <w:rFonts w:ascii="Arial" w:hAnsi="Arial" w:cs="Arial"/>
-          <w:b w:val="0"/>
-          <w:bCs w:val="0"/>
-          <w:i w:val="0"/>
-          <w:caps w:val="0"/>
-          <w:smallCaps w:val="0"/>
-          <w:strike w:val="0"/>
-          <w:color w:val="000000" w:themeColor="text1"/>
-          <w:spacing w:val="0"/>
-          <w:sz w:val="38"/>
-          <w:szCs w:val="38"/>
-          <w:u w:val="none"/>
-          <w:lang w:val="en-US"/>
-        </w:rPr>
-      </w:r>
-    </w:p>
-    <w:p>
-      <w:pPr>
-        <w:pBdr/>
-        <w:spacing/>
-        <w:ind/>
-        <w:rPr>
-          <w:highlight w:val="none"/>
-        </w:rPr>
-      </w:pPr>
-      <w:r>
-        <w:rPr>
-          <w:rFonts w:ascii="Arial" w:hAnsi="Arial" w:eastAsia="Arial" w:cs="Arial"/>
-          <w:b w:val="0"/>
-          <w:i w:val="0"/>
-          <w:caps w:val="0"/>
-          <w:smallCaps w:val="0"/>
-          <w:strike w:val="0"/>
-          <w:color w:val="000000" w:themeColor="text1"/>
-          <w:spacing w:val="0"/>
-          <w:u w:val="none"/>
-          <w:lang w:val="en-US"/>
-        </w:rPr>
-        <w:t xml:space="preserve">using statistical methods (Z-score, IQR, DBSCAN, or Isolation Forests).</w:t>
-      </w:r>
-      <w:r>
-        <w:rPr>
-          <w:rFonts w:ascii="Arial" w:hAnsi="Arial" w:cs="Arial"/>
-          <w:b w:val="0"/>
-          <w:i w:val="0"/>
-          <w:caps w:val="0"/>
-          <w:smallCaps w:val="0"/>
-          <w:strike w:val="0"/>
-          <w:color w:val="000000" w:themeColor="text1"/>
-          <w:spacing w:val="0"/>
-          <w:sz w:val="38"/>
-          <w:szCs w:val="38"/>
-          <w:u w:val="none"/>
-          <w:lang w:val="en-US"/>
-        </w:rPr>
-      </w:r>
-      <w:r>
-        <w:rPr>
-          <w:rFonts w:ascii="Arial" w:hAnsi="Arial" w:cs="Arial"/>
-          <w:b w:val="0"/>
-          <w:bCs w:val="0"/>
-          <w:i w:val="0"/>
-          <w:caps w:val="0"/>
-          <w:smallCaps w:val="0"/>
-          <w:strike w:val="0"/>
-          <w:color w:val="000000" w:themeColor="text1"/>
-          <w:spacing w:val="0"/>
-          <w:sz w:val="38"/>
-          <w:szCs w:val="38"/>
-          <w:u w:val="none"/>
-          <w:lang w:val="en-US"/>
-        </w:rPr>
-      </w:r>
-      <w:r>
-        <w:rPr>
-          <w:highlight w:val="none"/>
-        </w:rPr>
-        <w:t xml:space="preserve">.</w:t>
-      </w:r>
-      <w:r/>
-      <w:r/>
-    </w:p>
-    <w:p>
-      <w:pPr>
-        <w:pBdr/>
-        <w:spacing/>
-        <w:ind/>
-        <w:rPr>
-          <w:rFonts w:ascii="Arial" w:hAnsi="Arial" w:cs="Arial"/>
-          <w:b w:val="0"/>
-          <w:bCs w:val="0"/>
-          <w:i w:val="0"/>
-          <w:caps w:val="0"/>
-          <w:smallCaps w:val="0"/>
-          <w:strike w:val="0"/>
-          <w:color w:val="000000" w:themeColor="text1"/>
-          <w:spacing w:val="0"/>
-          <w:sz w:val="38"/>
-          <w:szCs w:val="38"/>
-          <w:u w:val="none"/>
-          <w:lang w:val="en-US"/>
-        </w:rPr>
-      </w:pPr>
-      <w:r>
-        <w:rPr>
-          <w:rFonts w:ascii="Arial" w:hAnsi="Arial" w:eastAsia="Arial" w:cs="Arial"/>
-          <w:b w:val="0"/>
-          <w:i w:val="0"/>
-          <w:caps w:val="0"/>
-          <w:smallCaps w:val="0"/>
-          <w:strike w:val="0"/>
-          <w:color w:val="000000" w:themeColor="text1"/>
-          <w:spacing w:val="0"/>
-          <w:u w:val="none"/>
-          <w:lang w:val="en-US"/>
-        </w:rPr>
-        <w:t xml:space="preserve">Data Integration: Merging disparate multi-source data through schema matching, entity resolution, and</w:t>
-      </w:r>
-      <w:r>
-        <w:rPr>
-          <w:rFonts w:ascii="Arial" w:hAnsi="Arial" w:cs="Arial"/>
-          <w:b w:val="0"/>
-          <w:i w:val="0"/>
-          <w:caps w:val="0"/>
-          <w:smallCaps w:val="0"/>
-          <w:strike w:val="0"/>
-          <w:color w:val="000000" w:themeColor="text1"/>
-          <w:spacing w:val="0"/>
-          <w:sz w:val="38"/>
-          <w:szCs w:val="38"/>
-          <w:u w:val="none"/>
-          <w:lang w:val="en-US"/>
-        </w:rPr>
-      </w:r>
-      <w:r>
-        <w:rPr>
-          <w:rFonts w:ascii="Arial" w:hAnsi="Arial" w:cs="Arial"/>
-          <w:b w:val="0"/>
-          <w:bCs w:val="0"/>
-          <w:i w:val="0"/>
-          <w:caps w:val="0"/>
-          <w:smallCaps w:val="0"/>
-          <w:strike w:val="0"/>
-          <w:color w:val="000000" w:themeColor="text1"/>
-          <w:spacing w:val="0"/>
-          <w:sz w:val="38"/>
-          <w:szCs w:val="38"/>
-          <w:u w:val="none"/>
-          <w:lang w:val="en-US"/>
-        </w:rPr>
-      </w:r>
-    </w:p>
-    <w:p>
-      <w:pPr>
-        <w:pBdr/>
-        <w:spacing/>
-        <w:ind/>
-        <w:rPr/>
-      </w:pPr>
-      <w:r>
-        <w:rPr>
-          <w:rFonts w:ascii="Arial" w:hAnsi="Arial" w:eastAsia="Arial" w:cs="Arial"/>
-          <w:b w:val="0"/>
-          <w:i w:val="0"/>
-          <w:caps w:val="0"/>
-          <w:smallCaps w:val="0"/>
-          <w:strike w:val="0"/>
-          <w:color w:val="000000" w:themeColor="text1"/>
-          <w:spacing w:val="0"/>
-          <w:u w:val="none"/>
-          <w:lang w:val="en-US"/>
-        </w:rPr>
-        <w:t xml:space="preserve">correlation analysis to remove systemic redundancies.</w:t>
-      </w:r>
-      <w:r>
-        <w:rPr>
-          <w:rFonts w:ascii="Arial" w:hAnsi="Arial" w:cs="Arial"/>
-          <w:b w:val="0"/>
           <w:i w:val="0"/>
           <w:caps w:val="0"/>
           <w:smallCaps w:val="0"/>
@@ -1040,6 +702,3341 @@
       </w:r>
       <w:r>
         <w:rPr>
+          <w:rFonts w:ascii="Arial" w:hAnsi="Arial" w:eastAsia="Arial" w:cs="Arial"/>
+          <w:b w:val="0"/>
+          <w:i w:val="0"/>
+          <w:caps w:val="0"/>
+          <w:smallCaps w:val="0"/>
+          <w:strike w:val="0"/>
+          <w:color w:val="000000" w:themeColor="text1"/>
+          <w:spacing w:val="0"/>
+          <w:u w:val="none"/>
+          <w:lang w:val="en-US"/>
+        </w:rPr>
+        <w:t xml:space="preserve">encoding).</w:t>
+      </w:r>
+      <w:r>
+        <w:rPr>
+          <w:highlight w:val="none"/>
+        </w:rPr>
+      </w:r>
+      <w:r>
+        <w:rPr>
+          <w:highlight w:val="none"/>
+        </w:rPr>
+      </w:r>
+      <w:r>
+        <w:rPr>
+          <w:highlight w:val="none"/>
+        </w:rPr>
+      </w:r>
+    </w:p>
+    <w:p>
+      <w:pPr>
+        <w:pBdr/>
+        <w:spacing/>
+        <w:ind/>
+        <w:rPr>
+          <w:rFonts w:ascii="Arial" w:hAnsi="Arial" w:cs="Arial"/>
+          <w:b w:val="0"/>
+          <w:bCs w:val="0"/>
+          <w:i w:val="0"/>
+          <w:caps w:val="0"/>
+          <w:smallCaps w:val="0"/>
+          <w:strike w:val="0"/>
+          <w:color w:val="000000" w:themeColor="text1"/>
+          <w:spacing w:val="0"/>
+          <w:sz w:val="38"/>
+          <w:szCs w:val="38"/>
+          <w:u w:val="none"/>
+          <w:lang w:val="en-US"/>
+        </w:rPr>
+      </w:pPr>
+      <w:r>
+        <w:rPr>
+          <w:rFonts w:ascii="Arial" w:hAnsi="Arial" w:eastAsia="Arial" w:cs="Arial"/>
+          <w:b w:val="0"/>
+          <w:i w:val="0"/>
+          <w:caps w:val="0"/>
+          <w:smallCaps w:val="0"/>
+          <w:strike w:val="0"/>
+          <w:color w:val="000000" w:themeColor="text1"/>
+          <w:spacing w:val="0"/>
+          <w:u w:val="none"/>
+          <w:lang w:val="en-US"/>
+        </w:rPr>
+        <w:t xml:space="preserve">Data Cleaning: Addressing structural issues by handling missing values (via deletion, statistical imputation </w:t>
+      </w:r>
+      <w:r>
+        <w:rPr>
+          <w:rFonts w:ascii="Arial" w:hAnsi="Arial" w:cs="Arial"/>
+          <w:b w:val="0"/>
+          <w:bCs w:val="0"/>
+          <w:i w:val="0"/>
+          <w:caps w:val="0"/>
+          <w:smallCaps w:val="0"/>
+          <w:strike w:val="0"/>
+          <w:color w:val="000000" w:themeColor="text1"/>
+          <w:spacing w:val="0"/>
+          <w:sz w:val="38"/>
+          <w:szCs w:val="38"/>
+          <w:u w:val="none"/>
+          <w:lang w:val="en-US"/>
+        </w:rPr>
+      </w:r>
+      <w:r>
+        <w:rPr>
+          <w:rFonts w:ascii="Arial" w:hAnsi="Arial" w:eastAsia="Arial" w:cs="Arial"/>
+          <w:b w:val="0"/>
+          <w:i w:val="0"/>
+          <w:caps w:val="0"/>
+          <w:smallCaps w:val="0"/>
+          <w:strike w:val="0"/>
+          <w:color w:val="000000" w:themeColor="text1"/>
+          <w:spacing w:val="0"/>
+          <w:u w:val="none"/>
+          <w:lang w:val="en-US"/>
+        </w:rPr>
+        <w:t xml:space="preserve">like mean/median/mode, or advanced algorithms like k-NN and autoencoders) and neutralizing outliers </w:t>
+      </w:r>
+      <w:r>
+        <w:rPr>
+          <w:rFonts w:ascii="Arial" w:hAnsi="Arial" w:cs="Arial"/>
+          <w:b w:val="0"/>
+          <w:bCs w:val="0"/>
+          <w:i w:val="0"/>
+          <w:caps w:val="0"/>
+          <w:smallCaps w:val="0"/>
+          <w:strike w:val="0"/>
+          <w:color w:val="000000" w:themeColor="text1"/>
+          <w:spacing w:val="0"/>
+          <w:sz w:val="38"/>
+          <w:szCs w:val="38"/>
+          <w:u w:val="none"/>
+          <w:lang w:val="en-US"/>
+        </w:rPr>
+      </w:r>
+      <w:r>
+        <w:rPr>
+          <w:rFonts w:ascii="Arial" w:hAnsi="Arial" w:cs="Arial"/>
+          <w:b w:val="0"/>
+          <w:bCs w:val="0"/>
+          <w:i w:val="0"/>
+          <w:caps w:val="0"/>
+          <w:smallCaps w:val="0"/>
+          <w:strike w:val="0"/>
+          <w:color w:val="000000" w:themeColor="text1"/>
+          <w:spacing w:val="0"/>
+          <w:sz w:val="38"/>
+          <w:szCs w:val="38"/>
+          <w:u w:val="none"/>
+          <w:lang w:val="en-US"/>
+        </w:rPr>
+      </w:r>
+      <w:r>
+        <w:rPr>
+          <w:rFonts w:ascii="Arial" w:hAnsi="Arial" w:cs="Arial"/>
+          <w:b w:val="0"/>
+          <w:bCs w:val="0"/>
+          <w:i w:val="0"/>
+          <w:caps w:val="0"/>
+          <w:smallCaps w:val="0"/>
+          <w:strike w:val="0"/>
+          <w:color w:val="000000" w:themeColor="text1"/>
+          <w:spacing w:val="0"/>
+          <w:sz w:val="38"/>
+          <w:szCs w:val="38"/>
+          <w:u w:val="none"/>
+          <w:lang w:val="en-US"/>
+        </w:rPr>
+      </w:r>
+      <w:r>
+        <w:rPr>
+          <w:rFonts w:ascii="Arial" w:hAnsi="Arial" w:eastAsia="Arial" w:cs="Arial"/>
+          <w:b w:val="0"/>
+          <w:i w:val="0"/>
+          <w:caps w:val="0"/>
+          <w:smallCaps w:val="0"/>
+          <w:strike w:val="0"/>
+          <w:color w:val="000000" w:themeColor="text1"/>
+          <w:spacing w:val="0"/>
+          <w:u w:val="none"/>
+          <w:lang w:val="en-US"/>
+        </w:rPr>
+        <w:t xml:space="preserve">using statistical methods (Z-score, IQR, DBSCAN, or Isolation Forests).</w:t>
+      </w:r>
+      <w:r>
+        <w:rPr>
+          <w:highlight w:val="none"/>
+        </w:rPr>
+        <w:t xml:space="preserve">.</w:t>
+      </w:r>
+      <w:r>
+        <w:rPr>
+          <w:highlight w:val="none"/>
+        </w:rPr>
+      </w:r>
+      <w:r>
+        <w:rPr>
+          <w:highlight w:val="none"/>
+        </w:rPr>
+      </w:r>
+      <w:r>
+        <w:rPr>
+          <w:rFonts w:ascii="Arial" w:hAnsi="Arial" w:cs="Arial"/>
+          <w:b w:val="0"/>
+          <w:bCs w:val="0"/>
+          <w:i w:val="0"/>
+          <w:caps w:val="0"/>
+          <w:smallCaps w:val="0"/>
+          <w:strike w:val="0"/>
+          <w:color w:val="000000" w:themeColor="text1"/>
+          <w:spacing w:val="0"/>
+          <w:sz w:val="38"/>
+          <w:szCs w:val="38"/>
+          <w:u w:val="none"/>
+          <w:lang w:val="en-US"/>
+        </w:rPr>
+      </w:r>
+    </w:p>
+    <w:p>
+      <w:pPr>
+        <w:pBdr/>
+        <w:spacing/>
+        <w:ind/>
+        <w:rPr>
+          <w:highlight w:val="none"/>
+        </w:rPr>
+      </w:pPr>
+      <w:r>
+        <w:rPr>
+          <w:rFonts w:ascii="Arial" w:hAnsi="Arial" w:eastAsia="Arial" w:cs="Arial"/>
+          <w:b w:val="0"/>
+          <w:i w:val="0"/>
+          <w:caps w:val="0"/>
+          <w:smallCaps w:val="0"/>
+          <w:strike w:val="0"/>
+          <w:color w:val="000000" w:themeColor="text1"/>
+          <w:spacing w:val="0"/>
+          <w:u w:val="none"/>
+          <w:lang w:val="en-US"/>
+        </w:rPr>
+        <w:t xml:space="preserve">Data Integration: Merging disparate multi-source data through schema matching, entity resolution, and </w:t>
+      </w:r>
+      <w:r>
+        <w:rPr>
+          <w:rFonts w:ascii="Arial" w:hAnsi="Arial" w:eastAsia="Arial" w:cs="Arial"/>
+          <w:b w:val="0"/>
+          <w:i w:val="0"/>
+          <w:caps w:val="0"/>
+          <w:smallCaps w:val="0"/>
+          <w:strike w:val="0"/>
+          <w:color w:val="000000" w:themeColor="text1"/>
+          <w:spacing w:val="0"/>
+          <w:u w:val="none"/>
+          <w:lang w:val="en-US"/>
+        </w:rPr>
+        <w:t xml:space="preserve">correlation analysis to remove systemic redundancies.</w:t>
+      </w:r>
+      <w:r>
+        <w:rPr>
+          <w:highlight w:val="none"/>
+        </w:rPr>
+      </w:r>
+      <w:r>
+        <w:rPr>
+          <w:highlight w:val="none"/>
+        </w:rPr>
+      </w:r>
+    </w:p>
+    <w:p>
+      <w:pPr>
+        <w:pBdr/>
+        <w:spacing/>
+        <w:ind/>
+        <w:rPr>
+          <w:highlight w:val="none"/>
+        </w:rPr>
+      </w:pPr>
+      <w:r>
+        <w:rPr>
+          <w:highlight w:val="none"/>
+        </w:rPr>
+      </w:r>
+      <w:r>
+        <w:rPr>
+          <w:highlight w:val="none"/>
+        </w:rPr>
+      </w:r>
+      <w:r>
+        <w:rPr>
+          <w:highlight w:val="none"/>
+        </w:rPr>
+      </w:r>
+    </w:p>
+    <w:p>
+      <w:pPr>
+        <w:pBdr/>
+        <w:spacing/>
+        <w:ind/>
+        <w:rPr>
+          <w:highlight w:val="none"/>
+        </w:rPr>
+      </w:pPr>
+      <w:r>
+        <w:rPr>
+          <w:highlight w:val="none"/>
+        </w:rPr>
+      </w:r>
+      <w:r>
+        <w:rPr>
+          <w:highlight w:val="none"/>
+        </w:rPr>
+      </w:r>
+      <w:r>
+        <w:rPr>
+          <w:highlight w:val="none"/>
+        </w:rPr>
+      </w:r>
+    </w:p>
+    <w:p>
+      <w:pPr>
+        <w:pBdr/>
+        <w:spacing/>
+        <w:ind/>
+        <w:rPr>
+          <w:highlight w:val="none"/>
+        </w:rPr>
+      </w:pPr>
+      <w:r>
+        <w:rPr>
+          <w:highlight w:val="none"/>
+        </w:rPr>
+      </w:r>
+      <w:r>
+        <w:rPr>
+          <w:highlight w:val="none"/>
+        </w:rPr>
+      </w:r>
+      <w:r>
+        <w:rPr>
+          <w:highlight w:val="none"/>
+        </w:rPr>
+      </w:r>
+    </w:p>
+    <w:p>
+      <w:pPr>
+        <w:pBdr/>
+        <w:spacing/>
+        <w:ind/>
+        <w:rPr>
+          <w:rFonts w:ascii="Arial" w:hAnsi="Arial" w:eastAsia="Arial" w:cs="Arial"/>
+          <w:b/>
+          <w:bCs w:val="0"/>
+          <w:i w:val="0"/>
+          <w:caps w:val="0"/>
+          <w:smallCaps w:val="0"/>
+          <w:strike w:val="0"/>
+          <w:color w:val="000000" w:themeColor="text1"/>
+          <w:spacing w:val="0"/>
+          <w:u w:val="none"/>
+          <w:lang w:val="en-US"/>
+        </w:rPr>
+      </w:pPr>
+      <w:r>
+        <w:rPr>
+          <w:rFonts w:ascii="Arial" w:hAnsi="Arial" w:eastAsia="Arial" w:cs="Arial"/>
+          <w:b/>
+          <w:i w:val="0"/>
+          <w:caps w:val="0"/>
+          <w:smallCaps w:val="0"/>
+          <w:strike w:val="0"/>
+          <w:color w:val="000000" w:themeColor="text1"/>
+          <w:spacing w:val="0"/>
+          <w:u w:val="none"/>
+          <w:lang w:val="en-US"/>
+        </w:rPr>
+        <w:t xml:space="preserve">Application of the Model Selected</w:t>
+      </w:r>
+      <w:r>
+        <w:rPr>
+          <w:rFonts w:ascii="Arial" w:hAnsi="Arial" w:cs="Arial"/>
+          <w:b/>
+          <w:bCs w:val="0"/>
+          <w:i w:val="0"/>
+          <w:caps w:val="0"/>
+          <w:smallCaps w:val="0"/>
+          <w:strike w:val="0"/>
+          <w:color w:val="000000" w:themeColor="text1"/>
+          <w:spacing w:val="0"/>
+          <w:sz w:val="40"/>
+          <w:szCs w:val="40"/>
+          <w:u w:val="none"/>
+          <w:lang w:val="en-US"/>
+        </w:rPr>
+      </w:r>
+    </w:p>
+    <w:p>
+      <w:pPr>
+        <w:pStyle w:val="668"/>
+        <w:numPr>
+          <w:ilvl w:val="0"/>
+          <w:numId w:val="7"/>
+        </w:numPr>
+        <w:pBdr/>
+        <w:spacing/>
+        <w:ind/>
+        <w:rPr>
+          <w:rFonts w:ascii="Arial" w:hAnsi="Arial" w:cs="Arial"/>
+          <w:b/>
+          <w:bCs w:val="0"/>
+          <w:i w:val="0"/>
+          <w:caps w:val="0"/>
+          <w:smallCaps w:val="0"/>
+          <w:strike w:val="0"/>
+          <w:color w:val="000000" w:themeColor="text1"/>
+          <w:spacing w:val="0"/>
+          <w:sz w:val="40"/>
+          <w:szCs w:val="40"/>
+          <w:u w:val="none"/>
+          <w:lang w:val="en-US"/>
+        </w:rPr>
+      </w:pPr>
+      <w:r>
+        <w:rPr>
+          <w:rFonts w:ascii="Arial" w:hAnsi="Arial" w:eastAsia="Arial" w:cs="Arial"/>
+          <w:b/>
+          <w:i w:val="0"/>
+          <w:caps w:val="0"/>
+          <w:smallCaps w:val="0"/>
+          <w:strike w:val="0"/>
+          <w:color w:val="000000" w:themeColor="text1"/>
+          <w:spacing w:val="0"/>
+          <w:u w:val="none"/>
+          <w:lang w:val="en-US"/>
+        </w:rPr>
+        <w:t xml:space="preserve"> 2-ML algos, to fit your features </w:t>
+      </w:r>
+      <w:r>
+        <w:rPr>
+          <w:rFonts w:ascii="Arial" w:hAnsi="Arial" w:cs="Arial"/>
+          <w:b/>
+          <w:bCs w:val="0"/>
+          <w:i w:val="0"/>
+          <w:caps w:val="0"/>
+          <w:smallCaps w:val="0"/>
+          <w:strike w:val="0"/>
+          <w:color w:val="000000" w:themeColor="text1"/>
+          <w:spacing w:val="0"/>
+          <w:sz w:val="40"/>
+          <w:szCs w:val="40"/>
+          <w:u w:val="none"/>
+          <w:lang w:val="en-US"/>
+        </w:rPr>
+      </w:r>
+      <w:r>
+        <w:rPr>
+          <w:rFonts w:ascii="Arial" w:hAnsi="Arial" w:cs="Arial"/>
+          <w:b/>
+          <w:bCs w:val="0"/>
+          <w:i w:val="0"/>
+          <w:caps w:val="0"/>
+          <w:smallCaps w:val="0"/>
+          <w:strike w:val="0"/>
+          <w:color w:val="000000" w:themeColor="text1"/>
+          <w:spacing w:val="0"/>
+          <w:sz w:val="40"/>
+          <w:szCs w:val="40"/>
+          <w:u w:val="none"/>
+          <w:lang w:val="en-US"/>
+        </w:rPr>
+      </w:r>
+    </w:p>
+    <w:p>
+      <w:pPr>
+        <w:pBdr/>
+        <w:spacing/>
+        <w:ind w:firstLine="0" w:left="0"/>
+        <w:rPr>
+          <w:rFonts w:ascii="Arial" w:hAnsi="Arial" w:cs="Arial"/>
+          <w:b w:val="0"/>
+          <w:bCs w:val="0"/>
+          <w:i w:val="0"/>
+          <w:caps w:val="0"/>
+          <w:smallCaps w:val="0"/>
+          <w:strike w:val="0"/>
+          <w:color w:val="000000" w:themeColor="text1"/>
+          <w:spacing w:val="0"/>
+          <w:sz w:val="22"/>
+          <w:szCs w:val="22"/>
+          <w:u w:val="none"/>
+        </w:rPr>
+      </w:pPr>
+      <w:r>
+        <w:rPr>
+          <w:rFonts w:ascii="Arial" w:hAnsi="Arial" w:cs="Arial"/>
+          <w:b w:val="0"/>
+          <w:bCs w:val="0"/>
+          <w:i w:val="0"/>
+          <w:caps w:val="0"/>
+          <w:smallCaps w:val="0"/>
+          <w:strike w:val="0"/>
+          <w:color w:val="000000" w:themeColor="text1"/>
+          <w:spacing w:val="0"/>
+          <w:sz w:val="22"/>
+          <w:szCs w:val="22"/>
+          <w:highlight w:val="none"/>
+          <w:u w:val="none"/>
+          <w:lang w:val="en-US" w:bidi="en-US"/>
+        </w:rPr>
+        <w:t xml:space="preserve">ML Algos used were, random Forest, standard regression</w:t>
+      </w:r>
+      <w:r>
+        <w:rPr>
+          <w:rFonts w:ascii="Arial" w:hAnsi="Arial" w:cs="Arial"/>
+          <w:b w:val="0"/>
+          <w:bCs w:val="0"/>
+          <w:i w:val="0"/>
+          <w:caps w:val="0"/>
+          <w:smallCaps w:val="0"/>
+          <w:strike w:val="0"/>
+          <w:color w:val="000000" w:themeColor="text1"/>
+          <w:spacing w:val="0"/>
+          <w:sz w:val="22"/>
+          <w:szCs w:val="22"/>
+          <w:u w:val="none"/>
+        </w:rPr>
+      </w:r>
+    </w:p>
+    <w:p>
+      <w:pPr>
+        <w:pStyle w:val="668"/>
+        <w:numPr>
+          <w:ilvl w:val="0"/>
+          <w:numId w:val="6"/>
+        </w:numPr>
+        <w:pBdr/>
+        <w:spacing/>
+        <w:ind/>
+        <w:rPr>
+          <w:rFonts w:ascii="Arial" w:hAnsi="Arial" w:cs="Arial"/>
+          <w:b/>
+          <w:bCs w:val="0"/>
+          <w:i w:val="0"/>
+          <w:caps w:val="0"/>
+          <w:smallCaps w:val="0"/>
+          <w:strike w:val="0"/>
+          <w:color w:val="000000" w:themeColor="text1"/>
+          <w:spacing w:val="0"/>
+          <w:sz w:val="40"/>
+          <w:szCs w:val="40"/>
+          <w:highlight w:val="none"/>
+          <w:u w:val="none"/>
+          <w:lang w:val="en-US"/>
+        </w:rPr>
+      </w:pPr>
+      <w:r>
+        <w:rPr>
+          <w:rFonts w:ascii="Arial" w:hAnsi="Arial" w:eastAsia="Arial" w:cs="Arial"/>
+          <w:b/>
+          <w:i w:val="0"/>
+          <w:caps w:val="0"/>
+          <w:smallCaps w:val="0"/>
+          <w:strike w:val="0"/>
+          <w:color w:val="000000" w:themeColor="text1"/>
+          <w:spacing w:val="0"/>
+          <w:u w:val="none"/>
+          <w:lang w:val="en-US"/>
+        </w:rPr>
+        <w:t xml:space="preserve"> how KPI is predicted with what is had</w:t>
+      </w:r>
+      <w:r>
+        <w:rPr>
+          <w:rFonts w:ascii="Arial" w:hAnsi="Arial" w:cs="Arial"/>
+          <w:b/>
+          <w:bCs w:val="0"/>
+          <w:i w:val="0"/>
+          <w:caps w:val="0"/>
+          <w:smallCaps w:val="0"/>
+          <w:strike w:val="0"/>
+          <w:color w:val="000000" w:themeColor="text1"/>
+          <w:spacing w:val="0"/>
+          <w:sz w:val="40"/>
+          <w:szCs w:val="40"/>
+          <w:u w:val="none"/>
+          <w:lang w:val="en-US"/>
+        </w:rPr>
+      </w:r>
+      <w:r/>
+    </w:p>
+    <w:p>
+      <w:pPr>
+        <w:pBdr/>
+        <w:spacing/>
+        <w:ind w:firstLine="0" w:left="0"/>
+        <w:rPr>
+          <w:rFonts w:ascii="Arial" w:hAnsi="Arial" w:cs="Arial"/>
+          <w:b w:val="0"/>
+          <w:bCs w:val="0"/>
+          <w:i w:val="0"/>
+          <w:caps w:val="0"/>
+          <w:smallCaps w:val="0"/>
+          <w:strike w:val="0"/>
+          <w:color w:val="000000" w:themeColor="text1"/>
+          <w:spacing w:val="0"/>
+          <w:sz w:val="22"/>
+          <w:szCs w:val="22"/>
+          <w:u w:val="none"/>
+        </w:rPr>
+      </w:pPr>
+      <w:r>
+        <w:rPr>
+          <w:rFonts w:ascii="Arial" w:hAnsi="Arial" w:cs="Arial"/>
+          <w:b w:val="0"/>
+          <w:bCs w:val="0"/>
+          <w:i w:val="0"/>
+          <w:caps w:val="0"/>
+          <w:smallCaps w:val="0"/>
+          <w:strike w:val="0"/>
+          <w:color w:val="000000" w:themeColor="text1"/>
+          <w:spacing w:val="0"/>
+          <w:sz w:val="22"/>
+          <w:szCs w:val="22"/>
+          <w:highlight w:val="none"/>
+          <w:u w:val="none"/>
+          <w:lang w:val="en-US" w:bidi="en-US"/>
+        </w:rPr>
+        <w:t xml:space="preserve">ML KPIs are predicted by the clustering done</w:t>
+      </w:r>
+      <w:r>
+        <w:rPr>
+          <w:rFonts w:ascii="Arial" w:hAnsi="Arial" w:cs="Arial"/>
+          <w:b w:val="0"/>
+          <w:bCs w:val="0"/>
+          <w:i w:val="0"/>
+          <w:caps w:val="0"/>
+          <w:smallCaps w:val="0"/>
+          <w:strike w:val="0"/>
+          <w:color w:val="000000" w:themeColor="text1"/>
+          <w:spacing w:val="0"/>
+          <w:sz w:val="22"/>
+          <w:szCs w:val="22"/>
+          <w:u w:val="none"/>
+        </w:rPr>
+      </w:r>
+      <w:r>
+        <w:rPr>
+          <w:rFonts w:ascii="Arial" w:hAnsi="Arial" w:cs="Arial"/>
+          <w:b w:val="0"/>
+          <w:bCs w:val="0"/>
+          <w:i w:val="0"/>
+          <w:caps w:val="0"/>
+          <w:smallCaps w:val="0"/>
+          <w:strike w:val="0"/>
+          <w:color w:val="000000" w:themeColor="text1"/>
+          <w:spacing w:val="0"/>
+          <w:sz w:val="22"/>
+          <w:szCs w:val="22"/>
+          <w:u w:val="none"/>
+        </w:rPr>
+      </w:r>
+    </w:p>
+    <w:p>
+      <w:pPr>
+        <w:pBdr/>
+        <w:spacing/>
+        <w:ind/>
+        <w:rPr>
+          <w:rFonts w:ascii="Arial" w:hAnsi="Arial" w:cs="Arial"/>
+          <w:b/>
+          <w:bCs w:val="0"/>
+          <w:i w:val="0"/>
+          <w:caps w:val="0"/>
+          <w:smallCaps w:val="0"/>
+          <w:strike w:val="0"/>
+          <w:color w:val="000000" w:themeColor="text1"/>
+          <w:spacing w:val="0"/>
+          <w:sz w:val="40"/>
+          <w:szCs w:val="40"/>
+          <w:u w:val="none"/>
+          <w:lang w:val="en-US"/>
+        </w:rPr>
+      </w:pPr>
+      <w:r>
+        <w:rPr>
+          <w:rFonts w:ascii="Arial" w:hAnsi="Arial" w:cs="Arial"/>
+          <w:b/>
+          <w:bCs w:val="0"/>
+          <w:i w:val="0"/>
+          <w:caps w:val="0"/>
+          <w:smallCaps w:val="0"/>
+          <w:strike w:val="0"/>
+          <w:color w:val="000000" w:themeColor="text1"/>
+          <w:spacing w:val="0"/>
+          <w:sz w:val="40"/>
+          <w:szCs w:val="40"/>
+          <w:u w:val="none"/>
+          <w:lang w:val="en-US"/>
+        </w:rPr>
+      </w:r>
+      <w:r>
+        <w:rPr>
+          <w:rFonts w:ascii="Arial" w:hAnsi="Arial" w:cs="Arial"/>
+          <w:b/>
+          <w:bCs w:val="0"/>
+          <w:i w:val="0"/>
+          <w:caps w:val="0"/>
+          <w:smallCaps w:val="0"/>
+          <w:strike w:val="0"/>
+          <w:color w:val="000000" w:themeColor="text1"/>
+          <w:spacing w:val="0"/>
+          <w:sz w:val="40"/>
+          <w:szCs w:val="40"/>
+          <w:u w:val="none"/>
+          <w:lang w:val="en-US"/>
+        </w:rPr>
+      </w:r>
+      <w:r>
+        <w:rPr>
+          <w:rFonts w:ascii="Arial" w:hAnsi="Arial" w:cs="Arial"/>
+          <w:b/>
+          <w:bCs w:val="0"/>
+          <w:i w:val="0"/>
+          <w:caps w:val="0"/>
+          <w:smallCaps w:val="0"/>
+          <w:strike w:val="0"/>
+          <w:color w:val="000000" w:themeColor="text1"/>
+          <w:spacing w:val="0"/>
+          <w:sz w:val="40"/>
+          <w:szCs w:val="40"/>
+          <w:u w:val="none"/>
+          <w:lang w:val="en-US"/>
+        </w:rPr>
+      </w:r>
+    </w:p>
+    <w:p>
+      <w:pPr>
+        <w:pBdr/>
+        <w:spacing/>
+        <w:ind/>
+        <w:rPr>
+          <w:rFonts w:ascii="Arial" w:hAnsi="Arial" w:cs="Arial"/>
+          <w:b/>
+          <w:bCs w:val="0"/>
+          <w:i w:val="0"/>
+          <w:caps w:val="0"/>
+          <w:smallCaps w:val="0"/>
+          <w:strike w:val="0"/>
+          <w:color w:val="000000" w:themeColor="text1"/>
+          <w:spacing w:val="0"/>
+          <w:sz w:val="40"/>
+          <w:szCs w:val="40"/>
+          <w:u w:val="none"/>
+          <w:lang w:val="en-US"/>
+        </w:rPr>
+      </w:pPr>
+      <w:r>
+        <w:rPr>
+          <w:rFonts w:ascii="Arial" w:hAnsi="Arial" w:cs="Arial"/>
+          <w:b/>
+          <w:i w:val="0"/>
+          <w:caps w:val="0"/>
+          <w:smallCaps w:val="0"/>
+          <w:strike w:val="0"/>
+          <w:color w:val="000000" w:themeColor="text1"/>
+          <w:spacing w:val="0"/>
+          <w:sz w:val="40"/>
+          <w:szCs w:val="40"/>
+          <w:highlight w:val="none"/>
+          <w:u w:val="none"/>
+          <w:lang w:val="en-US" w:bidi="en-US"/>
+        </w:rPr>
+      </w:r>
+      <w:r>
+        <w:rPr>
+          <w:rFonts w:ascii="Arial" w:hAnsi="Arial" w:cs="Arial"/>
+          <w:b/>
+          <w:i w:val="0"/>
+          <w:caps w:val="0"/>
+          <w:smallCaps w:val="0"/>
+          <w:strike w:val="0"/>
+          <w:color w:val="000000" w:themeColor="text1"/>
+          <w:spacing w:val="0"/>
+          <w:sz w:val="40"/>
+          <w:szCs w:val="40"/>
+          <w:highlight w:val="none"/>
+          <w:u w:val="none"/>
+          <w:lang w:val="en-US" w:bidi="en-US"/>
+        </w:rPr>
+      </w:r>
+      <w:r>
+        <w:rPr>
+          <w:rFonts w:ascii="Arial" w:hAnsi="Arial" w:cs="Arial"/>
+          <w:b/>
+          <w:i w:val="0"/>
+          <w:caps w:val="0"/>
+          <w:smallCaps w:val="0"/>
+          <w:strike w:val="0"/>
+          <w:color w:val="000000" w:themeColor="text1"/>
+          <w:spacing w:val="0"/>
+          <w:sz w:val="40"/>
+          <w:szCs w:val="40"/>
+          <w:highlight w:val="none"/>
+          <w:u w:val="none"/>
+          <w:lang w:val="en-US"/>
+        </w:rPr>
+      </w:r>
+    </w:p>
+    <w:p>
+      <w:pPr>
+        <w:pBdr/>
+        <w:spacing/>
+        <w:ind/>
+        <w:rPr>
+          <w:rFonts w:ascii="Arial" w:hAnsi="Arial" w:cs="Arial"/>
+          <w:b/>
+          <w:bCs w:val="0"/>
+          <w:i w:val="0"/>
+          <w:caps w:val="0"/>
+          <w:smallCaps w:val="0"/>
+          <w:strike w:val="0"/>
+          <w:color w:val="000000" w:themeColor="text1"/>
+          <w:spacing w:val="0"/>
+          <w:sz w:val="40"/>
+          <w:szCs w:val="40"/>
+          <w:u w:val="none"/>
+          <w:lang w:val="en-US"/>
+        </w:rPr>
+      </w:pPr>
+      <w:r>
+        <w:rPr>
+          <w:rFonts w:ascii="Arial" w:hAnsi="Arial" w:eastAsia="Arial" w:cs="Arial"/>
+          <w:b/>
+          <w:i w:val="0"/>
+          <w:caps w:val="0"/>
+          <w:smallCaps w:val="0"/>
+          <w:strike w:val="0"/>
+          <w:color w:val="000000" w:themeColor="text1"/>
+          <w:spacing w:val="0"/>
+          <w:u w:val="none"/>
+          <w:lang w:val="en-US"/>
+        </w:rPr>
+        <w:t xml:space="preserve">- Model Training and evaluation</w:t>
+      </w:r>
+      <w:r>
+        <w:rPr>
+          <w:rFonts w:ascii="Arial" w:hAnsi="Arial" w:cs="Arial"/>
+          <w:b/>
+          <w:i w:val="0"/>
+          <w:caps w:val="0"/>
+          <w:smallCaps w:val="0"/>
+          <w:strike w:val="0"/>
+          <w:color w:val="000000" w:themeColor="text1"/>
+          <w:spacing w:val="0"/>
+          <w:sz w:val="40"/>
+          <w:szCs w:val="40"/>
+          <w:u w:val="none"/>
+          <w:lang w:val="en-US"/>
+        </w:rPr>
+      </w:r>
+      <w:r>
+        <w:rPr>
+          <w:rFonts w:ascii="Arial" w:hAnsi="Arial" w:cs="Arial"/>
+          <w:b/>
+          <w:bCs w:val="0"/>
+          <w:i w:val="0"/>
+          <w:caps w:val="0"/>
+          <w:smallCaps w:val="0"/>
+          <w:strike w:val="0"/>
+          <w:color w:val="000000" w:themeColor="text1"/>
+          <w:spacing w:val="0"/>
+          <w:sz w:val="40"/>
+          <w:szCs w:val="40"/>
+          <w:u w:val="none"/>
+          <w:lang w:val="en-US"/>
+        </w:rPr>
+      </w:r>
+    </w:p>
+    <w:p>
+      <w:pPr>
+        <w:pBdr/>
+        <w:spacing/>
+        <w:ind/>
+        <w:rPr>
+          <w:highlight w:val="none"/>
+        </w:rPr>
+      </w:pPr>
+      <w:r>
+        <w:rPr>
+          <w:rFonts w:ascii="Arial" w:hAnsi="Arial" w:eastAsia="Arial" w:cs="Arial"/>
+          <w:b/>
+          <w:i w:val="0"/>
+          <w:caps w:val="0"/>
+          <w:smallCaps w:val="0"/>
+          <w:strike w:val="0"/>
+          <w:color w:val="000000" w:themeColor="text1"/>
+          <w:spacing w:val="0"/>
+          <w:u w:val="none"/>
+          <w:lang w:val="en-US"/>
+        </w:rPr>
+        <w:tab/>
+        <w:t xml:space="preserve">- Accuracy or precission</w:t>
+      </w:r>
+      <w:r>
+        <w:rPr>
+          <w:sz w:val="40"/>
+          <w:szCs w:val="40"/>
+        </w:rPr>
+      </w:r>
+      <w:r>
+        <w:rPr>
+          <w:sz w:val="40"/>
+          <w:szCs w:val="40"/>
+        </w:rPr>
+      </w:r>
+      <w:r>
+        <w:rPr>
+          <w:highlight w:val="none"/>
+        </w:rPr>
+      </w:r>
+      <w:r>
+        <w:rPr>
+          <w:highlight w:val="none"/>
+        </w:rPr>
+      </w:r>
+    </w:p>
+    <w:p>
+      <w:pPr>
+        <w:pBdr/>
+        <w:spacing/>
+        <w:ind/>
+        <w:rPr>
+          <w:highlight w:val="none"/>
+        </w:rPr>
+      </w:pPr>
+      <w:r>
+        <w:rPr>
+          <w:highlight w:val="none"/>
+        </w:rPr>
+      </w:r>
+      <w:r>
+        <w:rPr>
+          <w:highlight w:val="none"/>
+        </w:rPr>
+      </w:r>
+      <w:r>
+        <w:rPr>
+          <w:highlight w:val="none"/>
+        </w:rPr>
+      </w:r>
+    </w:p>
+    <w:p>
+      <w:pPr>
+        <w:pBdr/>
+        <w:spacing/>
+        <w:ind/>
+        <w:rPr>
+          <w:highlight w:val="none"/>
+        </w:rPr>
+      </w:pPr>
+      <w:r>
+        <w:rPr>
+          <w:highlight w:val="none"/>
+        </w:rPr>
+      </w:r>
+      <w:r>
+        <w:rPr>
+          <w:rFonts w:ascii="Arial" w:hAnsi="Arial" w:eastAsia="Arial" w:cs="Arial"/>
+          <w:b/>
+          <w:i w:val="0"/>
+          <w:caps w:val="0"/>
+          <w:smallCaps w:val="0"/>
+          <w:strike w:val="0"/>
+          <w:color w:val="000000" w:themeColor="text1"/>
+          <w:spacing w:val="0"/>
+          <w:u w:val="none"/>
+          <w:lang w:val="en-US"/>
+        </w:rPr>
+        <w:t xml:space="preserve">Carefull: using correlation test, detect data leakeage</w:t>
+      </w:r>
+      <w:r>
+        <w:rPr>
+          <w:highlight w:val="none"/>
+        </w:rPr>
+      </w:r>
+      <w:r>
+        <w:rPr>
+          <w:highlight w:val="none"/>
+        </w:rPr>
+      </w:r>
+      <w:r>
+        <w:rPr>
+          <w:highlight w:val="none"/>
+        </w:rPr>
+      </w:r>
+    </w:p>
+    <w:p>
+      <w:pPr>
+        <w:pBdr/>
+        <w:spacing/>
+        <w:ind/>
+        <w:rPr>
+          <w:highlight w:val="none"/>
+        </w:rPr>
+      </w:pPr>
+      <w:r>
+        <w:rPr>
+          <w:highlight w:val="none"/>
+        </w:rPr>
+      </w:r>
+      <w:r>
+        <w:rPr>
+          <w:highlight w:val="none"/>
+        </w:rPr>
+      </w:r>
+      <w:r>
+        <w:rPr>
+          <w:highlight w:val="none"/>
+        </w:rPr>
+      </w:r>
+    </w:p>
+    <w:p>
+      <w:pPr>
+        <w:pBdr/>
+        <w:spacing/>
+        <w:ind/>
+        <w:rPr>
+          <w:highlight w:val="none"/>
+        </w:rPr>
+      </w:pPr>
+      <w:r>
+        <w:rPr>
+          <w:highlight w:val="none"/>
+        </w:rPr>
+      </w:r>
+      <w:r>
+        <w:rPr>
+          <w:rFonts w:ascii="Arial" w:hAnsi="Arial" w:eastAsia="Arial" w:cs="Arial"/>
+          <w:b/>
+          <w:i w:val="0"/>
+          <w:caps w:val="0"/>
+          <w:smallCaps w:val="0"/>
+          <w:strike w:val="0"/>
+          <w:color w:val="000000" w:themeColor="text1"/>
+          <w:spacing w:val="0"/>
+          <w:u w:val="none"/>
+          <w:lang w:val="en-US"/>
+        </w:rPr>
+        <w:t xml:space="preserve">Utilize tables or chart</w:t>
+      </w:r>
+      <w:r/>
+      <w:r>
+        <w:rPr>
+          <w:highlight w:val="none"/>
+        </w:rPr>
+      </w:r>
+      <w:r>
+        <w:rPr>
+          <w:highlight w:val="none"/>
+        </w:rPr>
+      </w:r>
+      <w:r>
+        <w:rPr>
+          <w:highlight w:val="none"/>
+        </w:rPr>
+      </w:r>
+    </w:p>
+    <w:p>
+      <w:pPr>
+        <w:pBdr/>
+        <w:spacing/>
+        <w:ind/>
+        <w:rPr>
+          <w:highlight w:val="none"/>
+        </w:rPr>
+      </w:pPr>
+      <w:r>
+        <w:rPr>
+          <w:highlight w:val="none"/>
+        </w:rPr>
+      </w:r>
+      <w:r>
+        <mc:AlternateContent>
+          <mc:Choice Requires="wpg">
+            <w:drawing>
+              <wp:inline xmlns:wp="http://schemas.openxmlformats.org/drawingml/2006/wordprocessingDrawing" distT="0" distB="0" distL="0" distR="0">
+                <wp:extent cx="5943600" cy="5184475"/>
+                <wp:effectExtent l="0" t="0" r="0" b="0"/>
+                <wp:docPr id="1" name=""/>
+                <wp:cNvGraphicFramePr>
+                  <a:graphicFrameLocks xmlns:a="http://schemas.openxmlformats.org/drawingml/2006/main" noChangeAspect="1"/>
+                </wp:cNvGraphicFramePr>
+                <a:graphic xmlns:a="http://schemas.openxmlformats.org/drawingml/2006/main">
+                  <a:graphicData uri="http://schemas.openxmlformats.org/drawingml/2006/picture">
+                    <pic:pic xmlns:pic="http://schemas.openxmlformats.org/drawingml/2006/picture">
+                      <pic:nvPicPr>
+                        <pic:cNvPr id="501880493" name=""/>
+                        <pic:cNvPicPr>
+                          <a:picLocks noChangeAspect="1"/>
+                        </pic:cNvPicPr>
+                        <pic:nvPr/>
+                      </pic:nvPicPr>
+                      <pic:blipFill rotWithShape="1">
+                        <a:blip r:embed="rId10"/>
+                        <a:stretch/>
+                      </pic:blipFill>
+                      <pic:spPr bwMode="auto">
+                        <a:xfrm>
+                          <a:off x="0" y="0"/>
+                          <a:ext cx="5943599" cy="5184475"/>
+                        </a:xfrm>
+                        <a:prstGeom prst="rect">
+                          <a:avLst/>
+                        </a:prstGeom>
+                      </pic:spPr>
+                    </pic:pic>
+                  </a:graphicData>
+                </a:graphic>
+              </wp:inline>
+            </w:drawing>
+          </mc:Choice>
+          <mc:Fallback>
+            <w:pict>
+              <v:shapetype id="_x0000_t75" coordsize="21600,21600" o:spt="75" o:preferrelative="t" path="m@4@5l@4@11@9@11@9@5xe" filled="f" stroked="f">
+                <v:stroke joinstyle="miter"/>
+                <v:formulas>
+                  <v:f eqn="if lineDrawn pixelLineWidth 0"/>
+                  <v:f eqn="sum @0 1 0"/>
+                  <v:f eqn="sum 0 0 @1"/>
+                  <v:f eqn="prod @2 1 2"/>
+                  <v:f eqn="prod @3 21600 pixelWidth"/>
+                  <v:f eqn="prod @3 21600 pixelHeight"/>
+                  <v:f eqn="sum @0 0 1"/>
+                  <v:f eqn="prod @6 1 2"/>
+                  <v:f eqn="prod @7 21600 pixelWidth"/>
+                  <v:f eqn="sum @8 21600 0"/>
+                  <v:f eqn="prod @7 21600 pixelHeight"/>
+                  <v:f eqn="sum @10 21600 0"/>
+                </v:formulas>
+                <v:path o:extrusionok="f" gradientshapeok="t" o:connecttype="rect"/>
+                <o:lock v:ext="edit" aspectratio="t"/>
+              </v:shapetype>
+              <v:shape id="_x0000_i0" o:spid="_x0000_s0" type="#_x0000_t75" style="width:468.00pt;height:408.23pt;mso-wrap-distance-left:0.00pt;mso-wrap-distance-top:0.00pt;mso-wrap-distance-right:0.00pt;mso-wrap-distance-bottom:0.00pt;z-index:1;" stroked="false">
+                <v:imagedata r:id="rId10" o:title=""/>
+                <o:lock v:ext="edit" rotation="t"/>
+              </v:shape>
+            </w:pict>
+          </mc:Fallback>
+        </mc:AlternateContent>
+      </w:r>
+      <w:r>
+        <w:rPr>
+          <w:highlight w:val="none"/>
+        </w:rPr>
+      </w:r>
+      <w:r>
+        <w:rPr>
+          <w:highlight w:val="none"/>
+        </w:rPr>
+      </w:r>
+      <w:r>
+        <w:rPr>
+          <w:highlight w:val="none"/>
+        </w:rPr>
+      </w:r>
+    </w:p>
+    <w:p>
+      <w:pPr>
+        <w:pBdr/>
+        <w:spacing/>
+        <w:ind/>
+        <w:rPr>
+          <w:highlight w:val="none"/>
+        </w:rPr>
+      </w:pPr>
+      <w:r>
+        <w:rPr>
+          <w:highlight w:val="none"/>
+        </w:rPr>
+      </w:r>
+      <w:r>
+        <mc:AlternateContent>
+          <mc:Choice Requires="wpg">
+            <w:drawing>
+              <wp:inline xmlns:wp="http://schemas.openxmlformats.org/drawingml/2006/wordprocessingDrawing" distT="0" distB="0" distL="0" distR="0">
+                <wp:extent cx="4495800" cy="4524375"/>
+                <wp:effectExtent l="0" t="0" r="0" b="0"/>
+                <wp:docPr id="2" name=""/>
+                <wp:cNvGraphicFramePr>
+                  <a:graphicFrameLocks xmlns:a="http://schemas.openxmlformats.org/drawingml/2006/main" noChangeAspect="1"/>
+                </wp:cNvGraphicFramePr>
+                <a:graphic xmlns:a="http://schemas.openxmlformats.org/drawingml/2006/main">
+                  <a:graphicData uri="http://schemas.openxmlformats.org/drawingml/2006/picture">
+                    <pic:pic xmlns:pic="http://schemas.openxmlformats.org/drawingml/2006/picture">
+                      <pic:nvPicPr>
+                        <pic:cNvPr id="308744997" name=""/>
+                        <pic:cNvPicPr>
+                          <a:picLocks noChangeAspect="1"/>
+                        </pic:cNvPicPr>
+                        <pic:nvPr/>
+                      </pic:nvPicPr>
+                      <pic:blipFill rotWithShape="1">
+                        <a:blip r:embed="rId11"/>
+                        <a:stretch/>
+                      </pic:blipFill>
+                      <pic:spPr bwMode="auto">
+                        <a:xfrm>
+                          <a:off x="0" y="0"/>
+                          <a:ext cx="4495799" cy="4524374"/>
+                        </a:xfrm>
+                        <a:prstGeom prst="rect">
+                          <a:avLst/>
+                        </a:prstGeom>
+                      </pic:spPr>
+                    </pic:pic>
+                  </a:graphicData>
+                </a:graphic>
+              </wp:inline>
+            </w:drawing>
+          </mc:Choice>
+          <mc:Fallback>
+            <w:pict>
+              <v:shapetype id="_x0000_t75" coordsize="21600,21600" o:spt="75" o:preferrelative="t" path="m@4@5l@4@11@9@11@9@5xe" filled="f" stroked="f">
+                <v:stroke joinstyle="miter"/>
+                <v:formulas>
+                  <v:f eqn="if lineDrawn pixelLineWidth 0"/>
+                  <v:f eqn="sum @0 1 0"/>
+                  <v:f eqn="sum 0 0 @1"/>
+                  <v:f eqn="prod @2 1 2"/>
+                  <v:f eqn="prod @3 21600 pixelWidth"/>
+                  <v:f eqn="prod @3 21600 pixelHeight"/>
+                  <v:f eqn="sum @0 0 1"/>
+                  <v:f eqn="prod @6 1 2"/>
+                  <v:f eqn="prod @7 21600 pixelWidth"/>
+                  <v:f eqn="sum @8 21600 0"/>
+                  <v:f eqn="prod @7 21600 pixelHeight"/>
+                  <v:f eqn="sum @10 21600 0"/>
+                </v:formulas>
+                <v:path o:extrusionok="f" gradientshapeok="t" o:connecttype="rect"/>
+                <o:lock v:ext="edit" aspectratio="t"/>
+              </v:shapetype>
+              <v:shape id="_x0000_i1" o:spid="_x0000_s1" type="#_x0000_t75" style="width:354.00pt;height:356.25pt;mso-wrap-distance-left:0.00pt;mso-wrap-distance-top:0.00pt;mso-wrap-distance-right:0.00pt;mso-wrap-distance-bottom:0.00pt;z-index:1;" stroked="false">
+                <v:imagedata r:id="rId11" o:title=""/>
+                <o:lock v:ext="edit" rotation="t"/>
+              </v:shape>
+            </w:pict>
+          </mc:Fallback>
+        </mc:AlternateContent>
+      </w:r>
+      <w:r>
+        <w:rPr>
+          <w:highlight w:val="none"/>
+        </w:rPr>
+      </w:r>
+      <w:r>
+        <w:rPr>
+          <w:highlight w:val="none"/>
+        </w:rPr>
+      </w:r>
+      <w:r>
+        <w:rPr>
+          <w:highlight w:val="none"/>
+        </w:rPr>
+      </w:r>
+    </w:p>
+    <w:p>
+      <w:pPr>
+        <w:pBdr/>
+        <w:spacing/>
+        <w:ind/>
+        <w:rPr>
+          <w:highlight w:val="none"/>
+        </w:rPr>
+      </w:pPr>
+      <w:r>
+        <w:rPr>
+          <w:highlight w:val="none"/>
+        </w:rPr>
+      </w:r>
+      <w:r>
+        <mc:AlternateContent>
+          <mc:Choice Requires="wpg">
+            <w:drawing>
+              <wp:inline xmlns:wp="http://schemas.openxmlformats.org/drawingml/2006/wordprocessingDrawing" distT="0" distB="0" distL="0" distR="0">
+                <wp:extent cx="5048250" cy="5286375"/>
+                <wp:effectExtent l="0" t="0" r="0" b="0"/>
+                <wp:docPr id="3" name=""/>
+                <wp:cNvGraphicFramePr>
+                  <a:graphicFrameLocks xmlns:a="http://schemas.openxmlformats.org/drawingml/2006/main" noChangeAspect="1"/>
+                </wp:cNvGraphicFramePr>
+                <a:graphic xmlns:a="http://schemas.openxmlformats.org/drawingml/2006/main">
+                  <a:graphicData uri="http://schemas.openxmlformats.org/drawingml/2006/picture">
+                    <pic:pic xmlns:pic="http://schemas.openxmlformats.org/drawingml/2006/picture">
+                      <pic:nvPicPr>
+                        <pic:cNvPr id="156022118" name=""/>
+                        <pic:cNvPicPr>
+                          <a:picLocks noChangeAspect="1"/>
+                        </pic:cNvPicPr>
+                        <pic:nvPr/>
+                      </pic:nvPicPr>
+                      <pic:blipFill rotWithShape="1">
+                        <a:blip r:embed="rId12"/>
+                        <a:stretch/>
+                      </pic:blipFill>
+                      <pic:spPr bwMode="auto">
+                        <a:xfrm>
+                          <a:off x="0" y="0"/>
+                          <a:ext cx="5048249" cy="5286375"/>
+                        </a:xfrm>
+                        <a:prstGeom prst="rect">
+                          <a:avLst/>
+                        </a:prstGeom>
+                      </pic:spPr>
+                    </pic:pic>
+                  </a:graphicData>
+                </a:graphic>
+              </wp:inline>
+            </w:drawing>
+          </mc:Choice>
+          <mc:Fallback>
+            <w:pict>
+              <v:shapetype id="_x0000_t75" coordsize="21600,21600" o:spt="75" o:preferrelative="t" path="m@4@5l@4@11@9@11@9@5xe" filled="f" stroked="f">
+                <v:stroke joinstyle="miter"/>
+                <v:formulas>
+                  <v:f eqn="if lineDrawn pixelLineWidth 0"/>
+                  <v:f eqn="sum @0 1 0"/>
+                  <v:f eqn="sum 0 0 @1"/>
+                  <v:f eqn="prod @2 1 2"/>
+                  <v:f eqn="prod @3 21600 pixelWidth"/>
+                  <v:f eqn="prod @3 21600 pixelHeight"/>
+                  <v:f eqn="sum @0 0 1"/>
+                  <v:f eqn="prod @6 1 2"/>
+                  <v:f eqn="prod @7 21600 pixelWidth"/>
+                  <v:f eqn="sum @8 21600 0"/>
+                  <v:f eqn="prod @7 21600 pixelHeight"/>
+                  <v:f eqn="sum @10 21600 0"/>
+                </v:formulas>
+                <v:path o:extrusionok="f" gradientshapeok="t" o:connecttype="rect"/>
+                <o:lock v:ext="edit" aspectratio="t"/>
+              </v:shapetype>
+              <v:shape id="_x0000_i2" o:spid="_x0000_s2" type="#_x0000_t75" style="width:397.50pt;height:416.25pt;mso-wrap-distance-left:0.00pt;mso-wrap-distance-top:0.00pt;mso-wrap-distance-right:0.00pt;mso-wrap-distance-bottom:0.00pt;z-index:1;" stroked="false">
+                <v:imagedata r:id="rId12" o:title=""/>
+                <o:lock v:ext="edit" rotation="t"/>
+              </v:shape>
+            </w:pict>
+          </mc:Fallback>
+        </mc:AlternateContent>
+      </w:r>
+      <w:r>
+        <w:rPr>
+          <w:highlight w:val="none"/>
+        </w:rPr>
+      </w:r>
+      <w:r>
+        <w:rPr>
+          <w:highlight w:val="none"/>
+        </w:rPr>
+      </w:r>
+      <w:r>
+        <w:rPr>
+          <w:highlight w:val="none"/>
+        </w:rPr>
+      </w:r>
+    </w:p>
+    <w:p>
+      <w:pPr>
+        <w:pBdr/>
+        <w:spacing/>
+        <w:ind/>
+        <w:rPr>
+          <w:highlight w:val="none"/>
+        </w:rPr>
+      </w:pPr>
+      <w:r>
+        <w:rPr>
+          <w:highlight w:val="none"/>
+        </w:rPr>
+      </w:r>
+      <w:r>
+        <mc:AlternateContent>
+          <mc:Choice Requires="wpg">
+            <w:drawing>
+              <wp:inline xmlns:wp="http://schemas.openxmlformats.org/drawingml/2006/wordprocessingDrawing" distT="0" distB="0" distL="0" distR="0">
+                <wp:extent cx="4943475" cy="4829175"/>
+                <wp:effectExtent l="0" t="0" r="0" b="0"/>
+                <wp:docPr id="4" name=""/>
+                <wp:cNvGraphicFramePr>
+                  <a:graphicFrameLocks xmlns:a="http://schemas.openxmlformats.org/drawingml/2006/main" noChangeAspect="1"/>
+                </wp:cNvGraphicFramePr>
+                <a:graphic xmlns:a="http://schemas.openxmlformats.org/drawingml/2006/main">
+                  <a:graphicData uri="http://schemas.openxmlformats.org/drawingml/2006/picture">
+                    <pic:pic xmlns:pic="http://schemas.openxmlformats.org/drawingml/2006/picture">
+                      <pic:nvPicPr>
+                        <pic:cNvPr id="127395836" name=""/>
+                        <pic:cNvPicPr>
+                          <a:picLocks noChangeAspect="1"/>
+                        </pic:cNvPicPr>
+                        <pic:nvPr/>
+                      </pic:nvPicPr>
+                      <pic:blipFill rotWithShape="1">
+                        <a:blip r:embed="rId13"/>
+                        <a:stretch/>
+                      </pic:blipFill>
+                      <pic:spPr bwMode="auto">
+                        <a:xfrm>
+                          <a:off x="0" y="0"/>
+                          <a:ext cx="4943475" cy="4829175"/>
+                        </a:xfrm>
+                        <a:prstGeom prst="rect">
+                          <a:avLst/>
+                        </a:prstGeom>
+                      </pic:spPr>
+                    </pic:pic>
+                  </a:graphicData>
+                </a:graphic>
+              </wp:inline>
+            </w:drawing>
+          </mc:Choice>
+          <mc:Fallback>
+            <w:pict>
+              <v:shapetype id="_x0000_t75" coordsize="21600,21600" o:spt="75" o:preferrelative="t" path="m@4@5l@4@11@9@11@9@5xe" filled="f" stroked="f">
+                <v:stroke joinstyle="miter"/>
+                <v:formulas>
+                  <v:f eqn="if lineDrawn pixelLineWidth 0"/>
+                  <v:f eqn="sum @0 1 0"/>
+                  <v:f eqn="sum 0 0 @1"/>
+                  <v:f eqn="prod @2 1 2"/>
+                  <v:f eqn="prod @3 21600 pixelWidth"/>
+                  <v:f eqn="prod @3 21600 pixelHeight"/>
+                  <v:f eqn="sum @0 0 1"/>
+                  <v:f eqn="prod @6 1 2"/>
+                  <v:f eqn="prod @7 21600 pixelWidth"/>
+                  <v:f eqn="sum @8 21600 0"/>
+                  <v:f eqn="prod @7 21600 pixelHeight"/>
+                  <v:f eqn="sum @10 21600 0"/>
+                </v:formulas>
+                <v:path o:extrusionok="f" gradientshapeok="t" o:connecttype="rect"/>
+                <o:lock v:ext="edit" aspectratio="t"/>
+              </v:shapetype>
+              <v:shape id="_x0000_i3" o:spid="_x0000_s3" type="#_x0000_t75" style="width:389.25pt;height:380.25pt;mso-wrap-distance-left:0.00pt;mso-wrap-distance-top:0.00pt;mso-wrap-distance-right:0.00pt;mso-wrap-distance-bottom:0.00pt;z-index:1;" stroked="false">
+                <v:imagedata r:id="rId13" o:title=""/>
+                <o:lock v:ext="edit" rotation="t"/>
+              </v:shape>
+            </w:pict>
+          </mc:Fallback>
+        </mc:AlternateContent>
+      </w:r>
+      <w:r>
+        <w:rPr>
+          <w:highlight w:val="none"/>
+        </w:rPr>
+      </w:r>
+      <w:r>
+        <w:rPr>
+          <w:highlight w:val="none"/>
+        </w:rPr>
+      </w:r>
+      <w:r>
+        <w:rPr>
+          <w:highlight w:val="none"/>
+        </w:rPr>
+      </w:r>
+    </w:p>
+    <w:p>
+      <w:pPr>
+        <w:pBdr/>
+        <w:spacing/>
+        <w:ind/>
+        <w:rPr>
+          <w:highlight w:val="none"/>
+        </w:rPr>
+      </w:pPr>
+      <w:r>
+        <w:rPr>
+          <w:highlight w:val="none"/>
+        </w:rPr>
+      </w:r>
+      <w:r>
+        <mc:AlternateContent>
+          <mc:Choice Requires="wpg">
+            <w:drawing>
+              <wp:inline xmlns:wp="http://schemas.openxmlformats.org/drawingml/2006/wordprocessingDrawing" distT="0" distB="0" distL="0" distR="0">
+                <wp:extent cx="4838700" cy="3867150"/>
+                <wp:effectExtent l="0" t="0" r="0" b="0"/>
+                <wp:docPr id="5" name=""/>
+                <wp:cNvGraphicFramePr>
+                  <a:graphicFrameLocks xmlns:a="http://schemas.openxmlformats.org/drawingml/2006/main" noChangeAspect="1"/>
+                </wp:cNvGraphicFramePr>
+                <a:graphic xmlns:a="http://schemas.openxmlformats.org/drawingml/2006/main">
+                  <a:graphicData uri="http://schemas.openxmlformats.org/drawingml/2006/picture">
+                    <pic:pic xmlns:pic="http://schemas.openxmlformats.org/drawingml/2006/picture">
+                      <pic:nvPicPr>
+                        <pic:cNvPr id="1678950522" name=""/>
+                        <pic:cNvPicPr>
+                          <a:picLocks noChangeAspect="1"/>
+                        </pic:cNvPicPr>
+                        <pic:nvPr/>
+                      </pic:nvPicPr>
+                      <pic:blipFill rotWithShape="1">
+                        <a:blip r:embed="rId14"/>
+                        <a:stretch/>
+                      </pic:blipFill>
+                      <pic:spPr bwMode="auto">
+                        <a:xfrm>
+                          <a:off x="0" y="0"/>
+                          <a:ext cx="4838699" cy="3867149"/>
+                        </a:xfrm>
+                        <a:prstGeom prst="rect">
+                          <a:avLst/>
+                        </a:prstGeom>
+                      </pic:spPr>
+                    </pic:pic>
+                  </a:graphicData>
+                </a:graphic>
+              </wp:inline>
+            </w:drawing>
+          </mc:Choice>
+          <mc:Fallback>
+            <w:pict>
+              <v:shapetype id="_x0000_t75" coordsize="21600,21600" o:spt="75" o:preferrelative="t" path="m@4@5l@4@11@9@11@9@5xe" filled="f" stroked="f">
+                <v:stroke joinstyle="miter"/>
+                <v:formulas>
+                  <v:f eqn="if lineDrawn pixelLineWidth 0"/>
+                  <v:f eqn="sum @0 1 0"/>
+                  <v:f eqn="sum 0 0 @1"/>
+                  <v:f eqn="prod @2 1 2"/>
+                  <v:f eqn="prod @3 21600 pixelWidth"/>
+                  <v:f eqn="prod @3 21600 pixelHeight"/>
+                  <v:f eqn="sum @0 0 1"/>
+                  <v:f eqn="prod @6 1 2"/>
+                  <v:f eqn="prod @7 21600 pixelWidth"/>
+                  <v:f eqn="sum @8 21600 0"/>
+                  <v:f eqn="prod @7 21600 pixelHeight"/>
+                  <v:f eqn="sum @10 21600 0"/>
+                </v:formulas>
+                <v:path o:extrusionok="f" gradientshapeok="t" o:connecttype="rect"/>
+                <o:lock v:ext="edit" aspectratio="t"/>
+              </v:shapetype>
+              <v:shape id="_x0000_i4" o:spid="_x0000_s4" type="#_x0000_t75" style="width:381.00pt;height:304.50pt;mso-wrap-distance-left:0.00pt;mso-wrap-distance-top:0.00pt;mso-wrap-distance-right:0.00pt;mso-wrap-distance-bottom:0.00pt;z-index:1;" stroked="false">
+                <v:imagedata r:id="rId14" o:title=""/>
+                <o:lock v:ext="edit" rotation="t"/>
+              </v:shape>
+            </w:pict>
+          </mc:Fallback>
+        </mc:AlternateContent>
+      </w:r>
+      <w:r>
+        <w:rPr>
+          <w:highlight w:val="none"/>
+        </w:rPr>
+      </w:r>
+      <w:r>
+        <w:rPr>
+          <w:highlight w:val="none"/>
+        </w:rPr>
+      </w:r>
+      <w:r>
+        <w:rPr>
+          <w:highlight w:val="none"/>
+        </w:rPr>
+      </w:r>
+    </w:p>
+    <w:p>
+      <w:pPr>
+        <w:pBdr/>
+        <w:spacing/>
+        <w:ind/>
+        <w:rPr>
+          <w:highlight w:val="none"/>
+        </w:rPr>
+      </w:pPr>
+      <w:r>
+        <w:rPr>
+          <w:highlight w:val="none"/>
+        </w:rPr>
+      </w:r>
+      <w:r>
+        <mc:AlternateContent>
+          <mc:Choice Requires="wpg">
+            <w:drawing>
+              <wp:inline xmlns:wp="http://schemas.openxmlformats.org/drawingml/2006/wordprocessingDrawing" distT="0" distB="0" distL="0" distR="0">
+                <wp:extent cx="4524375" cy="5467350"/>
+                <wp:effectExtent l="0" t="0" r="0" b="0"/>
+                <wp:docPr id="6" name=""/>
+                <wp:cNvGraphicFramePr>
+                  <a:graphicFrameLocks xmlns:a="http://schemas.openxmlformats.org/drawingml/2006/main" noChangeAspect="1"/>
+                </wp:cNvGraphicFramePr>
+                <a:graphic xmlns:a="http://schemas.openxmlformats.org/drawingml/2006/main">
+                  <a:graphicData uri="http://schemas.openxmlformats.org/drawingml/2006/picture">
+                    <pic:pic xmlns:pic="http://schemas.openxmlformats.org/drawingml/2006/picture">
+                      <pic:nvPicPr>
+                        <pic:cNvPr id="1954199892" name=""/>
+                        <pic:cNvPicPr>
+                          <a:picLocks noChangeAspect="1"/>
+                        </pic:cNvPicPr>
+                        <pic:nvPr/>
+                      </pic:nvPicPr>
+                      <pic:blipFill rotWithShape="1">
+                        <a:blip r:embed="rId15"/>
+                        <a:stretch/>
+                      </pic:blipFill>
+                      <pic:spPr bwMode="auto">
+                        <a:xfrm>
+                          <a:off x="0" y="0"/>
+                          <a:ext cx="4524374" cy="5467349"/>
+                        </a:xfrm>
+                        <a:prstGeom prst="rect">
+                          <a:avLst/>
+                        </a:prstGeom>
+                      </pic:spPr>
+                    </pic:pic>
+                  </a:graphicData>
+                </a:graphic>
+              </wp:inline>
+            </w:drawing>
+          </mc:Choice>
+          <mc:Fallback>
+            <w:pict>
+              <v:shapetype id="_x0000_t75" coordsize="21600,21600" o:spt="75" o:preferrelative="t" path="m@4@5l@4@11@9@11@9@5xe" filled="f" stroked="f">
+                <v:stroke joinstyle="miter"/>
+                <v:formulas>
+                  <v:f eqn="if lineDrawn pixelLineWidth 0"/>
+                  <v:f eqn="sum @0 1 0"/>
+                  <v:f eqn="sum 0 0 @1"/>
+                  <v:f eqn="prod @2 1 2"/>
+                  <v:f eqn="prod @3 21600 pixelWidth"/>
+                  <v:f eqn="prod @3 21600 pixelHeight"/>
+                  <v:f eqn="sum @0 0 1"/>
+                  <v:f eqn="prod @6 1 2"/>
+                  <v:f eqn="prod @7 21600 pixelWidth"/>
+                  <v:f eqn="sum @8 21600 0"/>
+                  <v:f eqn="prod @7 21600 pixelHeight"/>
+                  <v:f eqn="sum @10 21600 0"/>
+                </v:formulas>
+                <v:path o:extrusionok="f" gradientshapeok="t" o:connecttype="rect"/>
+                <o:lock v:ext="edit" aspectratio="t"/>
+              </v:shapetype>
+              <v:shape id="_x0000_i5" o:spid="_x0000_s5" type="#_x0000_t75" style="width:356.25pt;height:430.50pt;mso-wrap-distance-left:0.00pt;mso-wrap-distance-top:0.00pt;mso-wrap-distance-right:0.00pt;mso-wrap-distance-bottom:0.00pt;z-index:1;" stroked="false">
+                <v:imagedata r:id="rId15" o:title=""/>
+                <o:lock v:ext="edit" rotation="t"/>
+              </v:shape>
+            </w:pict>
+          </mc:Fallback>
+        </mc:AlternateContent>
+      </w:r>
+      <w:r>
+        <w:rPr>
+          <w:highlight w:val="none"/>
+        </w:rPr>
+      </w:r>
+      <w:r>
+        <w:rPr>
+          <w:highlight w:val="none"/>
+        </w:rPr>
+      </w:r>
+      <w:r>
+        <w:rPr>
+          <w:highlight w:val="none"/>
+        </w:rPr>
+      </w:r>
+    </w:p>
+    <w:p>
+      <w:pPr>
+        <w:pBdr/>
+        <w:spacing/>
+        <w:ind/>
+        <w:rPr>
+          <w:highlight w:val="none"/>
+        </w:rPr>
+      </w:pPr>
+      <w:r>
+        <w:rPr>
+          <w:highlight w:val="none"/>
+        </w:rPr>
+      </w:r>
+      <w:r>
+        <mc:AlternateContent>
+          <mc:Choice Requires="wpg">
+            <w:drawing>
+              <wp:inline xmlns:wp="http://schemas.openxmlformats.org/drawingml/2006/wordprocessingDrawing" distT="0" distB="0" distL="0" distR="0">
+                <wp:extent cx="4781550" cy="4238625"/>
+                <wp:effectExtent l="0" t="0" r="0" b="0"/>
+                <wp:docPr id="7" name=""/>
+                <wp:cNvGraphicFramePr>
+                  <a:graphicFrameLocks xmlns:a="http://schemas.openxmlformats.org/drawingml/2006/main" noChangeAspect="1"/>
+                </wp:cNvGraphicFramePr>
+                <a:graphic xmlns:a="http://schemas.openxmlformats.org/drawingml/2006/main">
+                  <a:graphicData uri="http://schemas.openxmlformats.org/drawingml/2006/picture">
+                    <pic:pic xmlns:pic="http://schemas.openxmlformats.org/drawingml/2006/picture">
+                      <pic:nvPicPr>
+                        <pic:cNvPr id="1846329826" name=""/>
+                        <pic:cNvPicPr>
+                          <a:picLocks noChangeAspect="1"/>
+                        </pic:cNvPicPr>
+                        <pic:nvPr/>
+                      </pic:nvPicPr>
+                      <pic:blipFill rotWithShape="1">
+                        <a:blip r:embed="rId16"/>
+                        <a:stretch/>
+                      </pic:blipFill>
+                      <pic:spPr bwMode="auto">
+                        <a:xfrm>
+                          <a:off x="0" y="0"/>
+                          <a:ext cx="4781549" cy="4238624"/>
+                        </a:xfrm>
+                        <a:prstGeom prst="rect">
+                          <a:avLst/>
+                        </a:prstGeom>
+                      </pic:spPr>
+                    </pic:pic>
+                  </a:graphicData>
+                </a:graphic>
+              </wp:inline>
+            </w:drawing>
+          </mc:Choice>
+          <mc:Fallback>
+            <w:pict>
+              <v:shapetype id="_x0000_t75" coordsize="21600,21600" o:spt="75" o:preferrelative="t" path="m@4@5l@4@11@9@11@9@5xe" filled="f" stroked="f">
+                <v:stroke joinstyle="miter"/>
+                <v:formulas>
+                  <v:f eqn="if lineDrawn pixelLineWidth 0"/>
+                  <v:f eqn="sum @0 1 0"/>
+                  <v:f eqn="sum 0 0 @1"/>
+                  <v:f eqn="prod @2 1 2"/>
+                  <v:f eqn="prod @3 21600 pixelWidth"/>
+                  <v:f eqn="prod @3 21600 pixelHeight"/>
+                  <v:f eqn="sum @0 0 1"/>
+                  <v:f eqn="prod @6 1 2"/>
+                  <v:f eqn="prod @7 21600 pixelWidth"/>
+                  <v:f eqn="sum @8 21600 0"/>
+                  <v:f eqn="prod @7 21600 pixelHeight"/>
+                  <v:f eqn="sum @10 21600 0"/>
+                </v:formulas>
+                <v:path o:extrusionok="f" gradientshapeok="t" o:connecttype="rect"/>
+                <o:lock v:ext="edit" aspectratio="t"/>
+              </v:shapetype>
+              <v:shape id="_x0000_i6" o:spid="_x0000_s6" type="#_x0000_t75" style="width:376.50pt;height:333.75pt;mso-wrap-distance-left:0.00pt;mso-wrap-distance-top:0.00pt;mso-wrap-distance-right:0.00pt;mso-wrap-distance-bottom:0.00pt;z-index:1;" stroked="false">
+                <v:imagedata r:id="rId16" o:title=""/>
+                <o:lock v:ext="edit" rotation="t"/>
+              </v:shape>
+            </w:pict>
+          </mc:Fallback>
+        </mc:AlternateContent>
+      </w:r>
+      <w:r>
+        <w:rPr>
+          <w:highlight w:val="none"/>
+        </w:rPr>
+      </w:r>
+      <w:r>
+        <w:rPr>
+          <w:highlight w:val="none"/>
+        </w:rPr>
+      </w:r>
+      <w:r>
+        <w:rPr>
+          <w:highlight w:val="none"/>
+        </w:rPr>
+      </w:r>
+    </w:p>
+    <w:p>
+      <w:pPr>
+        <w:pBdr/>
+        <w:spacing/>
+        <w:ind/>
+        <w:rPr>
+          <w:highlight w:val="none"/>
+        </w:rPr>
+      </w:pPr>
+      <w:r>
+        <w:rPr>
+          <w:highlight w:val="none"/>
+        </w:rPr>
+      </w:r>
+      <w:r>
+        <mc:AlternateContent>
+          <mc:Choice Requires="wpg">
+            <w:drawing>
+              <wp:inline xmlns:wp="http://schemas.openxmlformats.org/drawingml/2006/wordprocessingDrawing" distT="0" distB="0" distL="0" distR="0">
+                <wp:extent cx="5943600" cy="4650885"/>
+                <wp:effectExtent l="0" t="0" r="0" b="0"/>
+                <wp:docPr id="8" name=""/>
+                <wp:cNvGraphicFramePr>
+                  <a:graphicFrameLocks xmlns:a="http://schemas.openxmlformats.org/drawingml/2006/main" noChangeAspect="1"/>
+                </wp:cNvGraphicFramePr>
+                <a:graphic xmlns:a="http://schemas.openxmlformats.org/drawingml/2006/main">
+                  <a:graphicData uri="http://schemas.openxmlformats.org/drawingml/2006/picture">
+                    <pic:pic xmlns:pic="http://schemas.openxmlformats.org/drawingml/2006/picture">
+                      <pic:nvPicPr>
+                        <pic:cNvPr id="377671905" name=""/>
+                        <pic:cNvPicPr>
+                          <a:picLocks noChangeAspect="1"/>
+                        </pic:cNvPicPr>
+                        <pic:nvPr/>
+                      </pic:nvPicPr>
+                      <pic:blipFill rotWithShape="1">
+                        <a:blip r:embed="rId17"/>
+                        <a:stretch/>
+                      </pic:blipFill>
+                      <pic:spPr bwMode="auto">
+                        <a:xfrm>
+                          <a:off x="0" y="0"/>
+                          <a:ext cx="5943599" cy="4650885"/>
+                        </a:xfrm>
+                        <a:prstGeom prst="rect">
+                          <a:avLst/>
+                        </a:prstGeom>
+                      </pic:spPr>
+                    </pic:pic>
+                  </a:graphicData>
+                </a:graphic>
+              </wp:inline>
+            </w:drawing>
+          </mc:Choice>
+          <mc:Fallback>
+            <w:pict>
+              <v:shapetype id="_x0000_t75" coordsize="21600,21600" o:spt="75" o:preferrelative="t" path="m@4@5l@4@11@9@11@9@5xe" filled="f" stroked="f">
+                <v:stroke joinstyle="miter"/>
+                <v:formulas>
+                  <v:f eqn="if lineDrawn pixelLineWidth 0"/>
+                  <v:f eqn="sum @0 1 0"/>
+                  <v:f eqn="sum 0 0 @1"/>
+                  <v:f eqn="prod @2 1 2"/>
+                  <v:f eqn="prod @3 21600 pixelWidth"/>
+                  <v:f eqn="prod @3 21600 pixelHeight"/>
+                  <v:f eqn="sum @0 0 1"/>
+                  <v:f eqn="prod @6 1 2"/>
+                  <v:f eqn="prod @7 21600 pixelWidth"/>
+                  <v:f eqn="sum @8 21600 0"/>
+                  <v:f eqn="prod @7 21600 pixelHeight"/>
+                  <v:f eqn="sum @10 21600 0"/>
+                </v:formulas>
+                <v:path o:extrusionok="f" gradientshapeok="t" o:connecttype="rect"/>
+                <o:lock v:ext="edit" aspectratio="t"/>
+              </v:shapetype>
+              <v:shape id="_x0000_i7" o:spid="_x0000_s7" type="#_x0000_t75" style="width:468.00pt;height:366.21pt;mso-wrap-distance-left:0.00pt;mso-wrap-distance-top:0.00pt;mso-wrap-distance-right:0.00pt;mso-wrap-distance-bottom:0.00pt;z-index:1;" stroked="false">
+                <v:imagedata r:id="rId17" o:title=""/>
+                <o:lock v:ext="edit" rotation="t"/>
+              </v:shape>
+            </w:pict>
+          </mc:Fallback>
+        </mc:AlternateContent>
+      </w:r>
+      <w:r>
+        <w:rPr>
+          <w:highlight w:val="none"/>
+        </w:rPr>
+      </w:r>
+      <w:r>
+        <w:rPr>
+          <w:highlight w:val="none"/>
+        </w:rPr>
+      </w:r>
+      <w:r>
+        <w:rPr>
+          <w:highlight w:val="none"/>
+        </w:rPr>
+      </w:r>
+    </w:p>
+    <w:p>
+      <w:pPr>
+        <w:pBdr/>
+        <w:spacing/>
+        <w:ind/>
+        <w:rPr>
+          <w:highlight w:val="none"/>
+        </w:rPr>
+      </w:pPr>
+      <w:r>
+        <w:rPr>
+          <w:highlight w:val="none"/>
+        </w:rPr>
+      </w:r>
+      <w:r>
+        <mc:AlternateContent>
+          <mc:Choice Requires="wpg">
+            <w:drawing>
+              <wp:inline xmlns:wp="http://schemas.openxmlformats.org/drawingml/2006/wordprocessingDrawing" distT="0" distB="0" distL="0" distR="0">
+                <wp:extent cx="5943600" cy="5386600"/>
+                <wp:effectExtent l="0" t="0" r="0" b="0"/>
+                <wp:docPr id="9" name=""/>
+                <wp:cNvGraphicFramePr>
+                  <a:graphicFrameLocks xmlns:a="http://schemas.openxmlformats.org/drawingml/2006/main" noChangeAspect="1"/>
+                </wp:cNvGraphicFramePr>
+                <a:graphic xmlns:a="http://schemas.openxmlformats.org/drawingml/2006/main">
+                  <a:graphicData uri="http://schemas.openxmlformats.org/drawingml/2006/picture">
+                    <pic:pic xmlns:pic="http://schemas.openxmlformats.org/drawingml/2006/picture">
+                      <pic:nvPicPr>
+                        <pic:cNvPr id="1903061917" name=""/>
+                        <pic:cNvPicPr>
+                          <a:picLocks noChangeAspect="1"/>
+                        </pic:cNvPicPr>
+                        <pic:nvPr/>
+                      </pic:nvPicPr>
+                      <pic:blipFill rotWithShape="1">
+                        <a:blip r:embed="rId18"/>
+                        <a:stretch/>
+                      </pic:blipFill>
+                      <pic:spPr bwMode="auto">
+                        <a:xfrm>
+                          <a:off x="0" y="0"/>
+                          <a:ext cx="5943599" cy="5386599"/>
+                        </a:xfrm>
+                        <a:prstGeom prst="rect">
+                          <a:avLst/>
+                        </a:prstGeom>
+                      </pic:spPr>
+                    </pic:pic>
+                  </a:graphicData>
+                </a:graphic>
+              </wp:inline>
+            </w:drawing>
+          </mc:Choice>
+          <mc:Fallback>
+            <w:pict>
+              <v:shapetype id="_x0000_t75" coordsize="21600,21600" o:spt="75" o:preferrelative="t" path="m@4@5l@4@11@9@11@9@5xe" filled="f" stroked="f">
+                <v:stroke joinstyle="miter"/>
+                <v:formulas>
+                  <v:f eqn="if lineDrawn pixelLineWidth 0"/>
+                  <v:f eqn="sum @0 1 0"/>
+                  <v:f eqn="sum 0 0 @1"/>
+                  <v:f eqn="prod @2 1 2"/>
+                  <v:f eqn="prod @3 21600 pixelWidth"/>
+                  <v:f eqn="prod @3 21600 pixelHeight"/>
+                  <v:f eqn="sum @0 0 1"/>
+                  <v:f eqn="prod @6 1 2"/>
+                  <v:f eqn="prod @7 21600 pixelWidth"/>
+                  <v:f eqn="sum @8 21600 0"/>
+                  <v:f eqn="prod @7 21600 pixelHeight"/>
+                  <v:f eqn="sum @10 21600 0"/>
+                </v:formulas>
+                <v:path o:extrusionok="f" gradientshapeok="t" o:connecttype="rect"/>
+                <o:lock v:ext="edit" aspectratio="t"/>
+              </v:shapetype>
+              <v:shape id="_x0000_i8" o:spid="_x0000_s8" type="#_x0000_t75" style="width:468.00pt;height:424.14pt;mso-wrap-distance-left:0.00pt;mso-wrap-distance-top:0.00pt;mso-wrap-distance-right:0.00pt;mso-wrap-distance-bottom:0.00pt;z-index:1;" stroked="false">
+                <v:imagedata r:id="rId18" o:title=""/>
+                <o:lock v:ext="edit" rotation="t"/>
+              </v:shape>
+            </w:pict>
+          </mc:Fallback>
+        </mc:AlternateContent>
+      </w:r>
+      <w:r>
+        <w:rPr>
+          <w:highlight w:val="none"/>
+        </w:rPr>
+      </w:r>
+      <w:r>
+        <w:rPr>
+          <w:highlight w:val="none"/>
+        </w:rPr>
+      </w:r>
+      <w:r>
+        <w:rPr>
+          <w:highlight w:val="none"/>
+        </w:rPr>
+      </w:r>
+    </w:p>
+    <w:p>
+      <w:pPr>
+        <w:pBdr/>
+        <w:spacing/>
+        <w:ind/>
+        <w:rPr>
+          <w:highlight w:val="none"/>
+        </w:rPr>
+      </w:pPr>
+      <w:r>
+        <w:rPr>
+          <w:highlight w:val="none"/>
+        </w:rPr>
+      </w:r>
+      <w:r/>
+      <w:r>
+        <mc:AlternateContent>
+          <mc:Choice Requires="wpg">
+            <w:drawing>
+              <wp:inline xmlns:wp="http://schemas.openxmlformats.org/drawingml/2006/wordprocessingDrawing" distT="0" distB="0" distL="0" distR="0">
+                <wp:extent cx="5943600" cy="7371774"/>
+                <wp:effectExtent l="0" t="0" r="0" b="0"/>
+                <wp:docPr id="10" name=""/>
+                <wp:cNvGraphicFramePr>
+                  <a:graphicFrameLocks xmlns:a="http://schemas.openxmlformats.org/drawingml/2006/main" noChangeAspect="1"/>
+                </wp:cNvGraphicFramePr>
+                <a:graphic xmlns:a="http://schemas.openxmlformats.org/drawingml/2006/main">
+                  <a:graphicData uri="http://schemas.openxmlformats.org/drawingml/2006/picture">
+                    <pic:pic xmlns:pic="http://schemas.openxmlformats.org/drawingml/2006/picture">
+                      <pic:nvPicPr>
+                        <pic:cNvPr id="1049661517" name=""/>
+                        <pic:cNvPicPr>
+                          <a:picLocks noChangeAspect="1"/>
+                        </pic:cNvPicPr>
+                        <pic:nvPr/>
+                      </pic:nvPicPr>
+                      <pic:blipFill rotWithShape="1">
+                        <a:blip r:embed="rId19"/>
+                        <a:stretch/>
+                      </pic:blipFill>
+                      <pic:spPr bwMode="auto">
+                        <a:xfrm>
+                          <a:off x="0" y="0"/>
+                          <a:ext cx="5943599" cy="7371774"/>
+                        </a:xfrm>
+                        <a:prstGeom prst="rect">
+                          <a:avLst/>
+                        </a:prstGeom>
+                      </pic:spPr>
+                    </pic:pic>
+                  </a:graphicData>
+                </a:graphic>
+              </wp:inline>
+            </w:drawing>
+          </mc:Choice>
+          <mc:Fallback>
+            <w:pict>
+              <v:shapetype id="_x0000_t75" coordsize="21600,21600" o:spt="75" o:preferrelative="t" path="m@4@5l@4@11@9@11@9@5xe" filled="f" stroked="f">
+                <v:stroke joinstyle="miter"/>
+                <v:formulas>
+                  <v:f eqn="if lineDrawn pixelLineWidth 0"/>
+                  <v:f eqn="sum @0 1 0"/>
+                  <v:f eqn="sum 0 0 @1"/>
+                  <v:f eqn="prod @2 1 2"/>
+                  <v:f eqn="prod @3 21600 pixelWidth"/>
+                  <v:f eqn="prod @3 21600 pixelHeight"/>
+                  <v:f eqn="sum @0 0 1"/>
+                  <v:f eqn="prod @6 1 2"/>
+                  <v:f eqn="prod @7 21600 pixelWidth"/>
+                  <v:f eqn="sum @8 21600 0"/>
+                  <v:f eqn="prod @7 21600 pixelHeight"/>
+                  <v:f eqn="sum @10 21600 0"/>
+                </v:formulas>
+                <v:path o:extrusionok="f" gradientshapeok="t" o:connecttype="rect"/>
+                <o:lock v:ext="edit" aspectratio="t"/>
+              </v:shapetype>
+              <v:shape id="_x0000_i9" o:spid="_x0000_s9" type="#_x0000_t75" style="width:468.00pt;height:580.45pt;mso-wrap-distance-left:0.00pt;mso-wrap-distance-top:0.00pt;mso-wrap-distance-right:0.00pt;mso-wrap-distance-bottom:0.00pt;z-index:1;" stroked="false">
+                <v:imagedata r:id="rId19" o:title=""/>
+                <o:lock v:ext="edit" rotation="t"/>
+              </v:shape>
+            </w:pict>
+          </mc:Fallback>
+        </mc:AlternateContent>
+      </w:r>
+      <w:r/>
+      <w:r>
+        <w:rPr>
+          <w:highlight w:val="none"/>
+        </w:rPr>
+      </w:r>
+      <w:r>
+        <w:rPr>
+          <w:highlight w:val="none"/>
+        </w:rPr>
+      </w:r>
+      <w:r>
+        <w:rPr>
+          <w:highlight w:val="none"/>
+        </w:rPr>
+      </w:r>
+    </w:p>
+    <w:p>
+      <w:pPr>
+        <w:pBdr/>
+        <w:spacing/>
+        <w:ind/>
+        <w:rPr>
+          <w:highlight w:val="none"/>
+        </w:rPr>
+      </w:pPr>
+      <w:r>
+        <w:rPr>
+          <w:highlight w:val="none"/>
+        </w:rPr>
+      </w:r>
+      <w:r>
+        <mc:AlternateContent>
+          <mc:Choice Requires="wpg">
+            <w:drawing>
+              <wp:inline xmlns:wp="http://schemas.openxmlformats.org/drawingml/2006/wordprocessingDrawing" distT="0" distB="0" distL="0" distR="0">
+                <wp:extent cx="3705225" cy="5019675"/>
+                <wp:effectExtent l="0" t="0" r="0" b="0"/>
+                <wp:docPr id="11" name=""/>
+                <wp:cNvGraphicFramePr>
+                  <a:graphicFrameLocks xmlns:a="http://schemas.openxmlformats.org/drawingml/2006/main" noChangeAspect="1"/>
+                </wp:cNvGraphicFramePr>
+                <a:graphic xmlns:a="http://schemas.openxmlformats.org/drawingml/2006/main">
+                  <a:graphicData uri="http://schemas.openxmlformats.org/drawingml/2006/picture">
+                    <pic:pic xmlns:pic="http://schemas.openxmlformats.org/drawingml/2006/picture">
+                      <pic:nvPicPr>
+                        <pic:cNvPr id="2020165056" name=""/>
+                        <pic:cNvPicPr>
+                          <a:picLocks noChangeAspect="1"/>
+                        </pic:cNvPicPr>
+                        <pic:nvPr/>
+                      </pic:nvPicPr>
+                      <pic:blipFill rotWithShape="1">
+                        <a:blip r:embed="rId20"/>
+                        <a:stretch/>
+                      </pic:blipFill>
+                      <pic:spPr bwMode="auto">
+                        <a:xfrm>
+                          <a:off x="0" y="0"/>
+                          <a:ext cx="3705224" cy="5019674"/>
+                        </a:xfrm>
+                        <a:prstGeom prst="rect">
+                          <a:avLst/>
+                        </a:prstGeom>
+                      </pic:spPr>
+                    </pic:pic>
+                  </a:graphicData>
+                </a:graphic>
+              </wp:inline>
+            </w:drawing>
+          </mc:Choice>
+          <mc:Fallback>
+            <w:pict>
+              <v:shapetype id="_x0000_t75" coordsize="21600,21600" o:spt="75" o:preferrelative="t" path="m@4@5l@4@11@9@11@9@5xe" filled="f" stroked="f">
+                <v:stroke joinstyle="miter"/>
+                <v:formulas>
+                  <v:f eqn="if lineDrawn pixelLineWidth 0"/>
+                  <v:f eqn="sum @0 1 0"/>
+                  <v:f eqn="sum 0 0 @1"/>
+                  <v:f eqn="prod @2 1 2"/>
+                  <v:f eqn="prod @3 21600 pixelWidth"/>
+                  <v:f eqn="prod @3 21600 pixelHeight"/>
+                  <v:f eqn="sum @0 0 1"/>
+                  <v:f eqn="prod @6 1 2"/>
+                  <v:f eqn="prod @7 21600 pixelWidth"/>
+                  <v:f eqn="sum @8 21600 0"/>
+                  <v:f eqn="prod @7 21600 pixelHeight"/>
+                  <v:f eqn="sum @10 21600 0"/>
+                </v:formulas>
+                <v:path o:extrusionok="f" gradientshapeok="t" o:connecttype="rect"/>
+                <o:lock v:ext="edit" aspectratio="t"/>
+              </v:shapetype>
+              <v:shape id="_x0000_i10" o:spid="_x0000_s10" type="#_x0000_t75" style="width:291.75pt;height:395.25pt;mso-wrap-distance-left:0.00pt;mso-wrap-distance-top:0.00pt;mso-wrap-distance-right:0.00pt;mso-wrap-distance-bottom:0.00pt;z-index:1;" stroked="false">
+                <v:imagedata r:id="rId20" o:title=""/>
+                <o:lock v:ext="edit" rotation="t"/>
+              </v:shape>
+            </w:pict>
+          </mc:Fallback>
+        </mc:AlternateContent>
+      </w:r>
+      <w:r>
+        <w:rPr>
+          <w:highlight w:val="none"/>
+        </w:rPr>
+      </w:r>
+      <w:r>
+        <w:rPr>
+          <w:highlight w:val="none"/>
+        </w:rPr>
+      </w:r>
+      <w:r>
+        <w:rPr>
+          <w:highlight w:val="none"/>
+        </w:rPr>
+      </w:r>
+    </w:p>
+    <w:p>
+      <w:pPr>
+        <w:pBdr/>
+        <w:spacing/>
+        <w:ind/>
+        <w:rPr>
+          <w:highlight w:val="none"/>
+        </w:rPr>
+      </w:pPr>
+      <w:r>
+        <w:rPr>
+          <w:highlight w:val="none"/>
+        </w:rPr>
+      </w:r>
+      <w:r>
+        <mc:AlternateContent>
+          <mc:Choice Requires="wpg">
+            <w:drawing>
+              <wp:inline xmlns:wp="http://schemas.openxmlformats.org/drawingml/2006/wordprocessingDrawing" distT="0" distB="0" distL="0" distR="0">
+                <wp:extent cx="5943600" cy="5314278"/>
+                <wp:effectExtent l="0" t="0" r="0" b="0"/>
+                <wp:docPr id="12" name=""/>
+                <wp:cNvGraphicFramePr>
+                  <a:graphicFrameLocks xmlns:a="http://schemas.openxmlformats.org/drawingml/2006/main" noChangeAspect="1"/>
+                </wp:cNvGraphicFramePr>
+                <a:graphic xmlns:a="http://schemas.openxmlformats.org/drawingml/2006/main">
+                  <a:graphicData uri="http://schemas.openxmlformats.org/drawingml/2006/picture">
+                    <pic:pic xmlns:pic="http://schemas.openxmlformats.org/drawingml/2006/picture">
+                      <pic:nvPicPr>
+                        <pic:cNvPr id="998702007" name=""/>
+                        <pic:cNvPicPr>
+                          <a:picLocks noChangeAspect="1"/>
+                        </pic:cNvPicPr>
+                        <pic:nvPr/>
+                      </pic:nvPicPr>
+                      <pic:blipFill rotWithShape="1">
+                        <a:blip r:embed="rId21"/>
+                        <a:stretch/>
+                      </pic:blipFill>
+                      <pic:spPr bwMode="auto">
+                        <a:xfrm>
+                          <a:off x="0" y="0"/>
+                          <a:ext cx="5943599" cy="5314277"/>
+                        </a:xfrm>
+                        <a:prstGeom prst="rect">
+                          <a:avLst/>
+                        </a:prstGeom>
+                      </pic:spPr>
+                    </pic:pic>
+                  </a:graphicData>
+                </a:graphic>
+              </wp:inline>
+            </w:drawing>
+          </mc:Choice>
+          <mc:Fallback>
+            <w:pict>
+              <v:shapetype id="_x0000_t75" coordsize="21600,21600" o:spt="75" o:preferrelative="t" path="m@4@5l@4@11@9@11@9@5xe" filled="f" stroked="f">
+                <v:stroke joinstyle="miter"/>
+                <v:formulas>
+                  <v:f eqn="if lineDrawn pixelLineWidth 0"/>
+                  <v:f eqn="sum @0 1 0"/>
+                  <v:f eqn="sum 0 0 @1"/>
+                  <v:f eqn="prod @2 1 2"/>
+                  <v:f eqn="prod @3 21600 pixelWidth"/>
+                  <v:f eqn="prod @3 21600 pixelHeight"/>
+                  <v:f eqn="sum @0 0 1"/>
+                  <v:f eqn="prod @6 1 2"/>
+                  <v:f eqn="prod @7 21600 pixelWidth"/>
+                  <v:f eqn="sum @8 21600 0"/>
+                  <v:f eqn="prod @7 21600 pixelHeight"/>
+                  <v:f eqn="sum @10 21600 0"/>
+                </v:formulas>
+                <v:path o:extrusionok="f" gradientshapeok="t" o:connecttype="rect"/>
+                <o:lock v:ext="edit" aspectratio="t"/>
+              </v:shapetype>
+              <v:shape id="_x0000_i11" o:spid="_x0000_s11" type="#_x0000_t75" style="width:468.00pt;height:418.45pt;mso-wrap-distance-left:0.00pt;mso-wrap-distance-top:0.00pt;mso-wrap-distance-right:0.00pt;mso-wrap-distance-bottom:0.00pt;z-index:1;" stroked="false">
+                <v:imagedata r:id="rId21" o:title=""/>
+                <o:lock v:ext="edit" rotation="t"/>
+              </v:shape>
+            </w:pict>
+          </mc:Fallback>
+        </mc:AlternateContent>
+      </w:r>
+      <w:r>
+        <w:rPr>
+          <w:highlight w:val="none"/>
+        </w:rPr>
+      </w:r>
+      <w:r>
+        <w:rPr>
+          <w:highlight w:val="none"/>
+        </w:rPr>
+      </w:r>
+      <w:r>
+        <w:rPr>
+          <w:highlight w:val="none"/>
+        </w:rPr>
+      </w:r>
+    </w:p>
+    <w:p>
+      <w:pPr>
+        <w:pBdr/>
+        <w:spacing/>
+        <w:ind/>
+        <w:rPr>
+          <w:highlight w:val="none"/>
+        </w:rPr>
+      </w:pPr>
+      <w:r>
+        <w:rPr>
+          <w:highlight w:val="none"/>
+        </w:rPr>
+      </w:r>
+      <w:r>
+        <mc:AlternateContent>
+          <mc:Choice Requires="wpg">
+            <w:drawing>
+              <wp:inline xmlns:wp="http://schemas.openxmlformats.org/drawingml/2006/wordprocessingDrawing" distT="0" distB="0" distL="0" distR="0">
+                <wp:extent cx="5943600" cy="6372985"/>
+                <wp:effectExtent l="0" t="0" r="0" b="0"/>
+                <wp:docPr id="13" name=""/>
+                <wp:cNvGraphicFramePr>
+                  <a:graphicFrameLocks xmlns:a="http://schemas.openxmlformats.org/drawingml/2006/main" noChangeAspect="1"/>
+                </wp:cNvGraphicFramePr>
+                <a:graphic xmlns:a="http://schemas.openxmlformats.org/drawingml/2006/main">
+                  <a:graphicData uri="http://schemas.openxmlformats.org/drawingml/2006/picture">
+                    <pic:pic xmlns:pic="http://schemas.openxmlformats.org/drawingml/2006/picture">
+                      <pic:nvPicPr>
+                        <pic:cNvPr id="1813422058" name=""/>
+                        <pic:cNvPicPr>
+                          <a:picLocks noChangeAspect="1"/>
+                        </pic:cNvPicPr>
+                        <pic:nvPr/>
+                      </pic:nvPicPr>
+                      <pic:blipFill rotWithShape="1">
+                        <a:blip r:embed="rId22"/>
+                        <a:stretch/>
+                      </pic:blipFill>
+                      <pic:spPr bwMode="auto">
+                        <a:xfrm>
+                          <a:off x="0" y="0"/>
+                          <a:ext cx="5943599" cy="6372985"/>
+                        </a:xfrm>
+                        <a:prstGeom prst="rect">
+                          <a:avLst/>
+                        </a:prstGeom>
+                      </pic:spPr>
+                    </pic:pic>
+                  </a:graphicData>
+                </a:graphic>
+              </wp:inline>
+            </w:drawing>
+          </mc:Choice>
+          <mc:Fallback>
+            <w:pict>
+              <v:shapetype id="_x0000_t75" coordsize="21600,21600" o:spt="75" o:preferrelative="t" path="m@4@5l@4@11@9@11@9@5xe" filled="f" stroked="f">
+                <v:stroke joinstyle="miter"/>
+                <v:formulas>
+                  <v:f eqn="if lineDrawn pixelLineWidth 0"/>
+                  <v:f eqn="sum @0 1 0"/>
+                  <v:f eqn="sum 0 0 @1"/>
+                  <v:f eqn="prod @2 1 2"/>
+                  <v:f eqn="prod @3 21600 pixelWidth"/>
+                  <v:f eqn="prod @3 21600 pixelHeight"/>
+                  <v:f eqn="sum @0 0 1"/>
+                  <v:f eqn="prod @6 1 2"/>
+                  <v:f eqn="prod @7 21600 pixelWidth"/>
+                  <v:f eqn="sum @8 21600 0"/>
+                  <v:f eqn="prod @7 21600 pixelHeight"/>
+                  <v:f eqn="sum @10 21600 0"/>
+                </v:formulas>
+                <v:path o:extrusionok="f" gradientshapeok="t" o:connecttype="rect"/>
+                <o:lock v:ext="edit" aspectratio="t"/>
+              </v:shapetype>
+              <v:shape id="_x0000_i12" o:spid="_x0000_s12" type="#_x0000_t75" style="width:468.00pt;height:501.81pt;mso-wrap-distance-left:0.00pt;mso-wrap-distance-top:0.00pt;mso-wrap-distance-right:0.00pt;mso-wrap-distance-bottom:0.00pt;z-index:1;" stroked="false">
+                <v:imagedata r:id="rId22" o:title=""/>
+                <o:lock v:ext="edit" rotation="t"/>
+              </v:shape>
+            </w:pict>
+          </mc:Fallback>
+        </mc:AlternateContent>
+      </w:r>
+      <w:r>
+        <w:rPr>
+          <w:highlight w:val="none"/>
+        </w:rPr>
+      </w:r>
+      <w:r>
+        <w:rPr>
+          <w:highlight w:val="none"/>
+        </w:rPr>
+      </w:r>
+      <w:r>
+        <w:rPr>
+          <w:highlight w:val="none"/>
+        </w:rPr>
+      </w:r>
+    </w:p>
+    <w:p>
+      <w:pPr>
+        <w:pBdr/>
+        <w:spacing/>
+        <w:ind/>
+        <w:rPr>
+          <w:highlight w:val="none"/>
+        </w:rPr>
+      </w:pPr>
+      <w:r>
+        <w:rPr>
+          <w:highlight w:val="none"/>
+        </w:rPr>
+      </w:r>
+      <w:r>
+        <mc:AlternateContent>
+          <mc:Choice Requires="wpg">
+            <w:drawing>
+              <wp:inline xmlns:wp="http://schemas.openxmlformats.org/drawingml/2006/wordprocessingDrawing" distT="0" distB="0" distL="0" distR="0">
+                <wp:extent cx="5943600" cy="6061564"/>
+                <wp:effectExtent l="0" t="0" r="0" b="0"/>
+                <wp:docPr id="14" name=""/>
+                <wp:cNvGraphicFramePr>
+                  <a:graphicFrameLocks xmlns:a="http://schemas.openxmlformats.org/drawingml/2006/main" noChangeAspect="1"/>
+                </wp:cNvGraphicFramePr>
+                <a:graphic xmlns:a="http://schemas.openxmlformats.org/drawingml/2006/main">
+                  <a:graphicData uri="http://schemas.openxmlformats.org/drawingml/2006/picture">
+                    <pic:pic xmlns:pic="http://schemas.openxmlformats.org/drawingml/2006/picture">
+                      <pic:nvPicPr>
+                        <pic:cNvPr id="442555214" name=""/>
+                        <pic:cNvPicPr>
+                          <a:picLocks noChangeAspect="1"/>
+                        </pic:cNvPicPr>
+                        <pic:nvPr/>
+                      </pic:nvPicPr>
+                      <pic:blipFill rotWithShape="1">
+                        <a:blip r:embed="rId23"/>
+                        <a:stretch/>
+                      </pic:blipFill>
+                      <pic:spPr bwMode="auto">
+                        <a:xfrm>
+                          <a:off x="0" y="0"/>
+                          <a:ext cx="5943599" cy="6061564"/>
+                        </a:xfrm>
+                        <a:prstGeom prst="rect">
+                          <a:avLst/>
+                        </a:prstGeom>
+                      </pic:spPr>
+                    </pic:pic>
+                  </a:graphicData>
+                </a:graphic>
+              </wp:inline>
+            </w:drawing>
+          </mc:Choice>
+          <mc:Fallback>
+            <w:pict>
+              <v:shapetype id="_x0000_t75" coordsize="21600,21600" o:spt="75" o:preferrelative="t" path="m@4@5l@4@11@9@11@9@5xe" filled="f" stroked="f">
+                <v:stroke joinstyle="miter"/>
+                <v:formulas>
+                  <v:f eqn="if lineDrawn pixelLineWidth 0"/>
+                  <v:f eqn="sum @0 1 0"/>
+                  <v:f eqn="sum 0 0 @1"/>
+                  <v:f eqn="prod @2 1 2"/>
+                  <v:f eqn="prod @3 21600 pixelWidth"/>
+                  <v:f eqn="prod @3 21600 pixelHeight"/>
+                  <v:f eqn="sum @0 0 1"/>
+                  <v:f eqn="prod @6 1 2"/>
+                  <v:f eqn="prod @7 21600 pixelWidth"/>
+                  <v:f eqn="sum @8 21600 0"/>
+                  <v:f eqn="prod @7 21600 pixelHeight"/>
+                  <v:f eqn="sum @10 21600 0"/>
+                </v:formulas>
+                <v:path o:extrusionok="f" gradientshapeok="t" o:connecttype="rect"/>
+                <o:lock v:ext="edit" aspectratio="t"/>
+              </v:shapetype>
+              <v:shape id="_x0000_i13" o:spid="_x0000_s13" type="#_x0000_t75" style="width:468.00pt;height:477.29pt;mso-wrap-distance-left:0.00pt;mso-wrap-distance-top:0.00pt;mso-wrap-distance-right:0.00pt;mso-wrap-distance-bottom:0.00pt;z-index:1;" stroked="false">
+                <v:imagedata r:id="rId23" o:title=""/>
+                <o:lock v:ext="edit" rotation="t"/>
+              </v:shape>
+            </w:pict>
+          </mc:Fallback>
+        </mc:AlternateContent>
+      </w:r>
+      <w:r>
+        <w:rPr>
+          <w:highlight w:val="none"/>
+        </w:rPr>
+      </w:r>
+      <w:r>
+        <w:rPr>
+          <w:highlight w:val="none"/>
+        </w:rPr>
+      </w:r>
+      <w:r>
+        <w:rPr>
+          <w:highlight w:val="none"/>
+        </w:rPr>
+      </w:r>
+    </w:p>
+    <w:p>
+      <w:pPr>
+        <w:pBdr/>
+        <w:spacing/>
+        <w:ind/>
+        <w:rPr>
+          <w:highlight w:val="none"/>
+        </w:rPr>
+      </w:pPr>
+      <w:r>
+        <w:rPr>
+          <w:highlight w:val="none"/>
+        </w:rPr>
+      </w:r>
+      <w:r>
+        <mc:AlternateContent>
+          <mc:Choice Requires="wpg">
+            <w:drawing>
+              <wp:inline xmlns:wp="http://schemas.openxmlformats.org/drawingml/2006/wordprocessingDrawing" distT="0" distB="0" distL="0" distR="0">
+                <wp:extent cx="5067300" cy="5362575"/>
+                <wp:effectExtent l="0" t="0" r="0" b="0"/>
+                <wp:docPr id="15" name=""/>
+                <wp:cNvGraphicFramePr>
+                  <a:graphicFrameLocks xmlns:a="http://schemas.openxmlformats.org/drawingml/2006/main" noChangeAspect="1"/>
+                </wp:cNvGraphicFramePr>
+                <a:graphic xmlns:a="http://schemas.openxmlformats.org/drawingml/2006/main">
+                  <a:graphicData uri="http://schemas.openxmlformats.org/drawingml/2006/picture">
+                    <pic:pic xmlns:pic="http://schemas.openxmlformats.org/drawingml/2006/picture">
+                      <pic:nvPicPr>
+                        <pic:cNvPr id="40600304" name=""/>
+                        <pic:cNvPicPr>
+                          <a:picLocks noChangeAspect="1"/>
+                        </pic:cNvPicPr>
+                        <pic:nvPr/>
+                      </pic:nvPicPr>
+                      <pic:blipFill rotWithShape="1">
+                        <a:blip r:embed="rId24"/>
+                        <a:stretch/>
+                      </pic:blipFill>
+                      <pic:spPr bwMode="auto">
+                        <a:xfrm>
+                          <a:off x="0" y="0"/>
+                          <a:ext cx="5067299" cy="5362574"/>
+                        </a:xfrm>
+                        <a:prstGeom prst="rect">
+                          <a:avLst/>
+                        </a:prstGeom>
+                      </pic:spPr>
+                    </pic:pic>
+                  </a:graphicData>
+                </a:graphic>
+              </wp:inline>
+            </w:drawing>
+          </mc:Choice>
+          <mc:Fallback>
+            <w:pict>
+              <v:shapetype id="_x0000_t75" coordsize="21600,21600" o:spt="75" o:preferrelative="t" path="m@4@5l@4@11@9@11@9@5xe" filled="f" stroked="f">
+                <v:stroke joinstyle="miter"/>
+                <v:formulas>
+                  <v:f eqn="if lineDrawn pixelLineWidth 0"/>
+                  <v:f eqn="sum @0 1 0"/>
+                  <v:f eqn="sum 0 0 @1"/>
+                  <v:f eqn="prod @2 1 2"/>
+                  <v:f eqn="prod @3 21600 pixelWidth"/>
+                  <v:f eqn="prod @3 21600 pixelHeight"/>
+                  <v:f eqn="sum @0 0 1"/>
+                  <v:f eqn="prod @6 1 2"/>
+                  <v:f eqn="prod @7 21600 pixelWidth"/>
+                  <v:f eqn="sum @8 21600 0"/>
+                  <v:f eqn="prod @7 21600 pixelHeight"/>
+                  <v:f eqn="sum @10 21600 0"/>
+                </v:formulas>
+                <v:path o:extrusionok="f" gradientshapeok="t" o:connecttype="rect"/>
+                <o:lock v:ext="edit" aspectratio="t"/>
+              </v:shapetype>
+              <v:shape id="_x0000_i14" o:spid="_x0000_s14" type="#_x0000_t75" style="width:399.00pt;height:422.25pt;mso-wrap-distance-left:0.00pt;mso-wrap-distance-top:0.00pt;mso-wrap-distance-right:0.00pt;mso-wrap-distance-bottom:0.00pt;z-index:1;" stroked="false">
+                <v:imagedata r:id="rId24" o:title=""/>
+                <o:lock v:ext="edit" rotation="t"/>
+              </v:shape>
+            </w:pict>
+          </mc:Fallback>
+        </mc:AlternateContent>
+      </w:r>
+      <w:r>
+        <w:rPr>
+          <w:highlight w:val="none"/>
+        </w:rPr>
+      </w:r>
+      <w:r>
+        <w:rPr>
+          <w:highlight w:val="none"/>
+        </w:rPr>
+      </w:r>
+      <w:r>
+        <w:rPr>
+          <w:highlight w:val="none"/>
+        </w:rPr>
+      </w:r>
+    </w:p>
+    <w:p>
+      <w:pPr>
+        <w:pBdr/>
+        <w:spacing/>
+        <w:ind/>
+        <w:rPr>
+          <w:highlight w:val="none"/>
+        </w:rPr>
+      </w:pPr>
+      <w:r>
+        <w:rPr>
+          <w:highlight w:val="none"/>
+        </w:rPr>
+      </w:r>
+      <w:r>
+        <w:rPr>
+          <w:highlight w:val="none"/>
+        </w:rPr>
+      </w:r>
+      <w:r>
+        <w:rPr>
+          <w:highlight w:val="none"/>
+        </w:rPr>
+      </w:r>
+    </w:p>
+    <w:p>
+      <w:pPr>
+        <w:pBdr/>
+        <w:spacing/>
+        <w:ind/>
+        <w:rPr>
+          <w:rFonts w:ascii="Arial" w:hAnsi="Arial" w:eastAsia="Arial" w:cs="Arial"/>
+          <w:b/>
+          <w:bCs w:val="0"/>
+          <w:i w:val="0"/>
+          <w:caps w:val="0"/>
+          <w:smallCaps w:val="0"/>
+          <w:strike w:val="0"/>
+          <w:color w:val="000000" w:themeColor="text1"/>
+          <w:spacing w:val="0"/>
+          <w:highlight w:val="none"/>
+          <w:u w:val="none"/>
+          <w:lang w:val="en-US"/>
+        </w:rPr>
+      </w:pPr>
+      <w:r>
+        <w:rPr>
+          <w:highlight w:val="none"/>
+        </w:rPr>
+      </w:r>
+      <w:r>
+        <w:rPr>
+          <w:rFonts w:ascii="Arial" w:hAnsi="Arial" w:eastAsia="Arial" w:cs="Arial"/>
+          <w:b/>
+          <w:i w:val="0"/>
+          <w:caps w:val="0"/>
+          <w:smallCaps w:val="0"/>
+          <w:strike w:val="0"/>
+          <w:color w:val="000000" w:themeColor="text1"/>
+          <w:spacing w:val="0"/>
+          <w:u w:val="none"/>
+          <w:lang w:val="en-US"/>
+        </w:rPr>
+        <w:t xml:space="preserve">Compare the Evaluatrion metrics</w:t>
+      </w:r>
+      <w:r>
+        <w:rPr>
+          <w:highlight w:val="none"/>
+        </w:rPr>
+      </w:r>
+    </w:p>
+    <w:p>
+      <w:pPr>
+        <w:pBdr/>
+        <w:spacing/>
+        <w:ind/>
+        <w:rPr>
+          <w:highlight w:val="none"/>
+        </w:rPr>
+      </w:pPr>
+      <w:r>
+        <w:rPr>
+          <w:highlight w:val="none"/>
+        </w:rPr>
+      </w:r>
+      <w:r>
+        <w:rPr>
+          <w:highlight w:val="none"/>
+        </w:rPr>
+      </w:r>
+      <w:r>
+        <w:rPr>
+          <w:highlight w:val="none"/>
+        </w:rPr>
+      </w:r>
+    </w:p>
+    <w:p>
+      <w:pPr>
+        <w:pBdr/>
+        <w:spacing/>
+        <w:ind/>
+        <w:rPr>
+          <w:highlight w:val="none"/>
+        </w:rPr>
+      </w:pPr>
+      <w:r>
+        <w:rPr>
+          <w:rFonts w:ascii="Arial" w:hAnsi="Arial" w:eastAsia="Arial" w:cs="Arial"/>
+          <w:b/>
+          <w:i w:val="0"/>
+          <w:caps w:val="0"/>
+          <w:smallCaps w:val="0"/>
+          <w:strike w:val="0"/>
+          <w:color w:val="000000" w:themeColor="text1"/>
+          <w:spacing w:val="0"/>
+          <w:highlight w:val="none"/>
+          <w:u w:val="none"/>
+          <w:lang w:val="en-US"/>
+        </w:rPr>
+        <w:t xml:space="preserve">CONCLUSION</w:t>
+      </w:r>
+      <w:r>
+        <w:rPr>
+          <w:rFonts w:ascii="Arial" w:hAnsi="Arial" w:eastAsia="Arial" w:cs="Arial"/>
+          <w:b/>
+          <w:i w:val="0"/>
+          <w:caps w:val="0"/>
+          <w:smallCaps w:val="0"/>
+          <w:strike w:val="0"/>
+          <w:color w:val="000000" w:themeColor="text1"/>
+          <w:spacing w:val="0"/>
+          <w:highlight w:val="none"/>
+          <w:u w:val="none"/>
+          <w:lang w:val="en-US"/>
+        </w:rPr>
+      </w:r>
+    </w:p>
+    <w:p>
+      <w:pPr>
+        <w:pBdr/>
+        <w:spacing/>
+        <w:ind/>
+        <w:rPr>
+          <w:rFonts w:ascii="Arial" w:hAnsi="Arial" w:cs="Arial"/>
+          <w:b/>
+          <w:bCs w:val="0"/>
+          <w:i w:val="0"/>
+          <w:caps w:val="0"/>
+          <w:smallCaps w:val="0"/>
+          <w:strike w:val="0"/>
+          <w:color w:val="000000" w:themeColor="text1"/>
+          <w:spacing w:val="0"/>
+          <w:sz w:val="56"/>
+          <w:szCs w:val="56"/>
+          <w:u w:val="none"/>
+          <w:lang w:val="en-US"/>
+        </w:rPr>
+      </w:pPr>
+      <w:r>
+        <w:rPr>
+          <w:rFonts w:ascii="Arial" w:hAnsi="Arial" w:eastAsia="Arial" w:cs="Arial"/>
+          <w:b/>
+          <w:i w:val="0"/>
+          <w:caps w:val="0"/>
+          <w:smallCaps w:val="0"/>
+          <w:strike w:val="0"/>
+          <w:color w:val="000000" w:themeColor="text1"/>
+          <w:spacing w:val="0"/>
+          <w:u w:val="none"/>
+          <w:lang w:val="en-US"/>
+        </w:rPr>
+        <w:t xml:space="preserve">Interpretation of various findings</w:t>
+      </w:r>
+      <w:r>
+        <w:rPr>
+          <w:rFonts w:ascii="Arial" w:hAnsi="Arial" w:cs="Arial"/>
+          <w:b/>
+          <w:i w:val="0"/>
+          <w:caps w:val="0"/>
+          <w:smallCaps w:val="0"/>
+          <w:strike w:val="0"/>
+          <w:color w:val="000000" w:themeColor="text1"/>
+          <w:spacing w:val="0"/>
+          <w:sz w:val="56"/>
+          <w:szCs w:val="56"/>
+          <w:u w:val="none"/>
+          <w:lang w:val="en-US"/>
+        </w:rPr>
+      </w:r>
+      <w:r>
+        <w:rPr>
+          <w:rFonts w:ascii="Arial" w:hAnsi="Arial" w:cs="Arial"/>
+          <w:b/>
+          <w:bCs w:val="0"/>
+          <w:i w:val="0"/>
+          <w:caps w:val="0"/>
+          <w:smallCaps w:val="0"/>
+          <w:strike w:val="0"/>
+          <w:color w:val="000000" w:themeColor="text1"/>
+          <w:spacing w:val="0"/>
+          <w:sz w:val="56"/>
+          <w:szCs w:val="56"/>
+          <w:u w:val="none"/>
+          <w:lang w:val="en-US"/>
+        </w:rPr>
+      </w:r>
+    </w:p>
+    <w:p>
+      <w:pPr>
+        <w:pBdr/>
+        <w:spacing/>
+        <w:ind/>
+        <w:rPr>
+          <w:highlight w:val="none"/>
+        </w:rPr>
+      </w:pPr>
+      <w:r>
+        <w:rPr>
+          <w:rFonts w:ascii="Arial" w:hAnsi="Arial" w:eastAsia="Arial" w:cs="Arial"/>
+          <w:b/>
+          <w:i w:val="0"/>
+          <w:caps w:val="0"/>
+          <w:smallCaps w:val="0"/>
+          <w:strike w:val="0"/>
+          <w:color w:val="000000" w:themeColor="text1"/>
+          <w:spacing w:val="0"/>
+          <w:u w:val="none"/>
+          <w:lang w:val="en-US"/>
+        </w:rPr>
+        <w:t xml:space="preserve">- Key drivers of the business indicators (KPI)</w:t>
+      </w:r>
+      <w:r>
+        <w:rPr>
+          <w:sz w:val="56"/>
+          <w:szCs w:val="56"/>
+        </w:rPr>
+      </w:r>
+      <w:r>
+        <w:rPr>
+          <w:sz w:val="56"/>
+          <w:szCs w:val="56"/>
+        </w:rPr>
+      </w:r>
+      <w:r>
+        <w:rPr>
+          <w:highlight w:val="none"/>
+        </w:rPr>
+      </w:r>
+      <w:r>
+        <w:rPr>
+          <w:highlight w:val="none"/>
+        </w:rPr>
+      </w:r>
+      <w:r>
+        <w:rPr>
+          <w:highlight w:val="none"/>
+        </w:rPr>
+      </w:r>
+    </w:p>
+    <w:p>
+      <w:pPr>
+        <w:pBdr/>
+        <w:spacing/>
+        <w:ind/>
+        <w:rPr>
+          <w:highlight w:val="none"/>
+        </w:rPr>
+      </w:pPr>
+      <w:r>
+        <w:rPr>
+          <w:highlight w:val="none"/>
+        </w:rPr>
+      </w:r>
+      <w:r>
+        <w:rPr>
+          <w:highlight w:val="none"/>
+        </w:rPr>
+      </w:r>
+      <w:r>
+        <w:rPr>
+          <w:highlight w:val="none"/>
+        </w:rPr>
+      </w:r>
+    </w:p>
+    <w:p>
+      <w:pPr>
+        <w:pBdr/>
+        <w:spacing/>
+        <w:ind/>
+        <w:rPr>
+          <w:rFonts w:ascii="Arial" w:hAnsi="Arial" w:cs="Arial"/>
+          <w:b/>
+          <w:bCs w:val="0"/>
+          <w:i w:val="0"/>
+          <w:caps w:val="0"/>
+          <w:smallCaps w:val="0"/>
+          <w:strike w:val="0"/>
+          <w:color w:val="000000" w:themeColor="text1"/>
+          <w:spacing w:val="0"/>
+          <w:sz w:val="56"/>
+          <w:szCs w:val="56"/>
+          <w:u w:val="none"/>
+          <w:lang w:val="en-US"/>
+        </w:rPr>
+      </w:pPr>
+      <w:r>
+        <w:rPr>
+          <w:rFonts w:ascii="Arial" w:hAnsi="Arial" w:eastAsia="Arial" w:cs="Arial"/>
+          <w:b/>
+          <w:i w:val="0"/>
+          <w:caps w:val="0"/>
+          <w:smallCaps w:val="0"/>
+          <w:strike w:val="0"/>
+          <w:color w:val="000000" w:themeColor="text1"/>
+          <w:spacing w:val="0"/>
+          <w:u w:val="none"/>
+          <w:lang w:val="en-US"/>
+        </w:rPr>
+        <w:t xml:space="preserve">Suggest next course of action</w:t>
+      </w:r>
+      <w:r>
+        <w:rPr>
+          <w:rFonts w:ascii="Arial" w:hAnsi="Arial" w:cs="Arial"/>
+          <w:b/>
+          <w:i w:val="0"/>
+          <w:caps w:val="0"/>
+          <w:smallCaps w:val="0"/>
+          <w:strike w:val="0"/>
+          <w:color w:val="000000" w:themeColor="text1"/>
+          <w:spacing w:val="0"/>
+          <w:sz w:val="56"/>
+          <w:szCs w:val="56"/>
+          <w:u w:val="none"/>
+          <w:lang w:val="en-US"/>
+        </w:rPr>
+      </w:r>
+      <w:r>
+        <w:rPr>
+          <w:rFonts w:ascii="Arial" w:hAnsi="Arial" w:cs="Arial"/>
+          <w:b/>
+          <w:bCs w:val="0"/>
+          <w:i w:val="0"/>
+          <w:caps w:val="0"/>
+          <w:smallCaps w:val="0"/>
+          <w:strike w:val="0"/>
+          <w:color w:val="000000" w:themeColor="text1"/>
+          <w:spacing w:val="0"/>
+          <w:sz w:val="56"/>
+          <w:szCs w:val="56"/>
+          <w:u w:val="none"/>
+          <w:lang w:val="en-US"/>
+        </w:rPr>
+      </w:r>
+    </w:p>
+    <w:p>
+      <w:pPr>
+        <w:pBdr/>
+        <w:spacing/>
+        <w:ind/>
+        <w:rPr>
+          <w:highlight w:val="none"/>
+        </w:rPr>
+      </w:pPr>
+      <w:r>
+        <w:rPr>
+          <w:rFonts w:ascii="Arial" w:hAnsi="Arial" w:eastAsia="Arial" w:cs="Arial"/>
+          <w:b/>
+          <w:i w:val="0"/>
+          <w:caps w:val="0"/>
+          <w:smallCaps w:val="0"/>
+          <w:strike w:val="0"/>
+          <w:color w:val="000000" w:themeColor="text1"/>
+          <w:spacing w:val="0"/>
+          <w:u w:val="none"/>
+          <w:lang w:val="en-US"/>
+        </w:rPr>
+        <w:t xml:space="preserve">- Based on the Driver and Key results</w:t>
+      </w:r>
+      <w:r>
+        <w:rPr>
+          <w:sz w:val="56"/>
+          <w:szCs w:val="56"/>
+        </w:rPr>
+      </w:r>
+      <w:r>
+        <w:rPr>
+          <w:sz w:val="56"/>
+          <w:szCs w:val="56"/>
+        </w:rPr>
+      </w:r>
+      <w:r>
+        <w:rPr>
+          <w:highlight w:val="none"/>
+        </w:rPr>
+      </w:r>
+      <w:r>
+        <w:rPr>
+          <w:highlight w:val="none"/>
+        </w:rPr>
+      </w:r>
+      <w:r>
+        <w:rPr>
+          <w:highlight w:val="none"/>
+        </w:rPr>
+      </w:r>
+    </w:p>
+    <w:p>
+      <w:pPr>
+        <w:pBdr/>
+        <w:spacing/>
+        <w:ind/>
+        <w:rPr>
+          <w:highlight w:val="none"/>
+        </w:rPr>
+      </w:pPr>
+      <w:r>
+        <w:rPr>
+          <w:highlight w:val="none"/>
+        </w:rPr>
+        <mc:AlternateContent>
+          <mc:Choice Requires="wpg">
+            <w:drawing>
+              <wp:inline xmlns:wp="http://schemas.openxmlformats.org/drawingml/2006/wordprocessingDrawing" distT="0" distB="0" distL="0" distR="0">
+                <wp:extent cx="5943600" cy="4176147"/>
+                <wp:effectExtent l="0" t="0" r="0" b="0"/>
+                <wp:docPr id="16" name=""/>
+                <wp:cNvGraphicFramePr>
+                  <a:graphicFrameLocks xmlns:a="http://schemas.openxmlformats.org/drawingml/2006/main" noChangeAspect="1"/>
+                </wp:cNvGraphicFramePr>
+                <a:graphic xmlns:a="http://schemas.openxmlformats.org/drawingml/2006/main">
+                  <a:graphicData uri="http://schemas.openxmlformats.org/drawingml/2006/picture">
+                    <pic:pic xmlns:pic="http://schemas.openxmlformats.org/drawingml/2006/picture">
+                      <pic:nvPicPr>
+                        <pic:cNvPr id="1239672529" name=""/>
+                        <pic:cNvPicPr>
+                          <a:picLocks noChangeAspect="1"/>
+                        </pic:cNvPicPr>
+                        <pic:nvPr/>
+                      </pic:nvPicPr>
+                      <pic:blipFill rotWithShape="1">
+                        <a:blip r:embed="rId25"/>
+                        <a:stretch/>
+                      </pic:blipFill>
+                      <pic:spPr bwMode="auto">
+                        <a:xfrm>
+                          <a:off x="0" y="0"/>
+                          <a:ext cx="5943599" cy="4176146"/>
+                        </a:xfrm>
+                        <a:prstGeom prst="rect">
+                          <a:avLst/>
+                        </a:prstGeom>
+                      </pic:spPr>
+                    </pic:pic>
+                  </a:graphicData>
+                </a:graphic>
+              </wp:inline>
+            </w:drawing>
+          </mc:Choice>
+          <mc:Fallback>
+            <w:pict>
+              <v:shapetype id="_x0000_t75" coordsize="21600,21600" o:spt="75" o:preferrelative="t" path="m@4@5l@4@11@9@11@9@5xe" filled="f" stroked="f">
+                <v:stroke joinstyle="miter"/>
+                <v:formulas>
+                  <v:f eqn="if lineDrawn pixelLineWidth 0"/>
+                  <v:f eqn="sum @0 1 0"/>
+                  <v:f eqn="sum 0 0 @1"/>
+                  <v:f eqn="prod @2 1 2"/>
+                  <v:f eqn="prod @3 21600 pixelWidth"/>
+                  <v:f eqn="prod @3 21600 pixelHeight"/>
+                  <v:f eqn="sum @0 0 1"/>
+                  <v:f eqn="prod @6 1 2"/>
+                  <v:f eqn="prod @7 21600 pixelWidth"/>
+                  <v:f eqn="sum @8 21600 0"/>
+                  <v:f eqn="prod @7 21600 pixelHeight"/>
+                  <v:f eqn="sum @10 21600 0"/>
+                </v:formulas>
+                <v:path o:extrusionok="f" gradientshapeok="t" o:connecttype="rect"/>
+                <o:lock v:ext="edit" aspectratio="t"/>
+              </v:shapetype>
+              <v:shape id="_x0000_i15" o:spid="_x0000_s15" type="#_x0000_t75" style="width:468.00pt;height:328.83pt;mso-wrap-distance-left:0.00pt;mso-wrap-distance-top:0.00pt;mso-wrap-distance-right:0.00pt;mso-wrap-distance-bottom:0.00pt;z-index:1;" stroked="false">
+                <v:imagedata r:id="rId25" o:title=""/>
+                <o:lock v:ext="edit" rotation="t"/>
+              </v:shape>
+            </w:pict>
+          </mc:Fallback>
+        </mc:AlternateContent>
+        <mc:AlternateContent>
+          <mc:Choice Requires="wpg">
+            <w:drawing>
+              <wp:inline xmlns:wp="http://schemas.openxmlformats.org/drawingml/2006/wordprocessingDrawing" distT="0" distB="0" distL="0" distR="0">
+                <wp:extent cx="5943600" cy="4233871"/>
+                <wp:effectExtent l="0" t="0" r="0" b="0"/>
+                <wp:docPr id="17" name=""/>
+                <wp:cNvGraphicFramePr>
+                  <a:graphicFrameLocks xmlns:a="http://schemas.openxmlformats.org/drawingml/2006/main" noChangeAspect="1"/>
+                </wp:cNvGraphicFramePr>
+                <a:graphic xmlns:a="http://schemas.openxmlformats.org/drawingml/2006/main">
+                  <a:graphicData uri="http://schemas.openxmlformats.org/drawingml/2006/picture">
+                    <pic:pic xmlns:pic="http://schemas.openxmlformats.org/drawingml/2006/picture">
+                      <pic:nvPicPr>
+                        <pic:cNvPr id="1187815711" name=""/>
+                        <pic:cNvPicPr>
+                          <a:picLocks noChangeAspect="1"/>
+                        </pic:cNvPicPr>
+                        <pic:nvPr/>
+                      </pic:nvPicPr>
+                      <pic:blipFill rotWithShape="1">
+                        <a:blip r:embed="rId26"/>
+                        <a:stretch/>
+                      </pic:blipFill>
+                      <pic:spPr bwMode="auto">
+                        <a:xfrm>
+                          <a:off x="0" y="0"/>
+                          <a:ext cx="5943599" cy="4233871"/>
+                        </a:xfrm>
+                        <a:prstGeom prst="rect">
+                          <a:avLst/>
+                        </a:prstGeom>
+                      </pic:spPr>
+                    </pic:pic>
+                  </a:graphicData>
+                </a:graphic>
+              </wp:inline>
+            </w:drawing>
+          </mc:Choice>
+          <mc:Fallback>
+            <w:pict>
+              <v:shapetype id="_x0000_t75" coordsize="21600,21600" o:spt="75" o:preferrelative="t" path="m@4@5l@4@11@9@11@9@5xe" filled="f" stroked="f">
+                <v:stroke joinstyle="miter"/>
+                <v:formulas>
+                  <v:f eqn="if lineDrawn pixelLineWidth 0"/>
+                  <v:f eqn="sum @0 1 0"/>
+                  <v:f eqn="sum 0 0 @1"/>
+                  <v:f eqn="prod @2 1 2"/>
+                  <v:f eqn="prod @3 21600 pixelWidth"/>
+                  <v:f eqn="prod @3 21600 pixelHeight"/>
+                  <v:f eqn="sum @0 0 1"/>
+                  <v:f eqn="prod @6 1 2"/>
+                  <v:f eqn="prod @7 21600 pixelWidth"/>
+                  <v:f eqn="sum @8 21600 0"/>
+                  <v:f eqn="prod @7 21600 pixelHeight"/>
+                  <v:f eqn="sum @10 21600 0"/>
+                </v:formulas>
+                <v:path o:extrusionok="f" gradientshapeok="t" o:connecttype="rect"/>
+                <o:lock v:ext="edit" aspectratio="t"/>
+              </v:shapetype>
+              <v:shape id="_x0000_i16" o:spid="_x0000_s16" type="#_x0000_t75" style="width:468.00pt;height:333.38pt;mso-wrap-distance-left:0.00pt;mso-wrap-distance-top:0.00pt;mso-wrap-distance-right:0.00pt;mso-wrap-distance-bottom:0.00pt;z-index:1;" stroked="false">
+                <v:imagedata r:id="rId26" o:title=""/>
+                <o:lock v:ext="edit" rotation="t"/>
+              </v:shape>
+            </w:pict>
+          </mc:Fallback>
+        </mc:AlternateContent>
+        <mc:AlternateContent>
+          <mc:Choice Requires="wpg">
+            <w:drawing>
+              <wp:inline xmlns:wp="http://schemas.openxmlformats.org/drawingml/2006/wordprocessingDrawing" distT="0" distB="0" distL="0" distR="0">
+                <wp:extent cx="5295900" cy="5105400"/>
+                <wp:effectExtent l="0" t="0" r="0" b="0"/>
+                <wp:docPr id="18" name=""/>
+                <wp:cNvGraphicFramePr>
+                  <a:graphicFrameLocks xmlns:a="http://schemas.openxmlformats.org/drawingml/2006/main" noChangeAspect="1"/>
+                </wp:cNvGraphicFramePr>
+                <a:graphic xmlns:a="http://schemas.openxmlformats.org/drawingml/2006/main">
+                  <a:graphicData uri="http://schemas.openxmlformats.org/drawingml/2006/picture">
+                    <pic:pic xmlns:pic="http://schemas.openxmlformats.org/drawingml/2006/picture">
+                      <pic:nvPicPr>
+                        <pic:cNvPr id="1399644907" name=""/>
+                        <pic:cNvPicPr>
+                          <a:picLocks noChangeAspect="1"/>
+                        </pic:cNvPicPr>
+                        <pic:nvPr/>
+                      </pic:nvPicPr>
+                      <pic:blipFill rotWithShape="1">
+                        <a:blip r:embed="rId27"/>
+                        <a:stretch/>
+                      </pic:blipFill>
+                      <pic:spPr bwMode="auto">
+                        <a:xfrm>
+                          <a:off x="0" y="0"/>
+                          <a:ext cx="5295899" cy="5105399"/>
+                        </a:xfrm>
+                        <a:prstGeom prst="rect">
+                          <a:avLst/>
+                        </a:prstGeom>
+                      </pic:spPr>
+                    </pic:pic>
+                  </a:graphicData>
+                </a:graphic>
+              </wp:inline>
+            </w:drawing>
+          </mc:Choice>
+          <mc:Fallback>
+            <w:pict>
+              <v:shapetype id="_x0000_t75" coordsize="21600,21600" o:spt="75" o:preferrelative="t" path="m@4@5l@4@11@9@11@9@5xe" filled="f" stroked="f">
+                <v:stroke joinstyle="miter"/>
+                <v:formulas>
+                  <v:f eqn="if lineDrawn pixelLineWidth 0"/>
+                  <v:f eqn="sum @0 1 0"/>
+                  <v:f eqn="sum 0 0 @1"/>
+                  <v:f eqn="prod @2 1 2"/>
+                  <v:f eqn="prod @3 21600 pixelWidth"/>
+                  <v:f eqn="prod @3 21600 pixelHeight"/>
+                  <v:f eqn="sum @0 0 1"/>
+                  <v:f eqn="prod @6 1 2"/>
+                  <v:f eqn="prod @7 21600 pixelWidth"/>
+                  <v:f eqn="sum @8 21600 0"/>
+                  <v:f eqn="prod @7 21600 pixelHeight"/>
+                  <v:f eqn="sum @10 21600 0"/>
+                </v:formulas>
+                <v:path o:extrusionok="f" gradientshapeok="t" o:connecttype="rect"/>
+                <o:lock v:ext="edit" aspectratio="t"/>
+              </v:shapetype>
+              <v:shape id="_x0000_i17" o:spid="_x0000_s17" type="#_x0000_t75" style="width:417.00pt;height:402.00pt;mso-wrap-distance-left:0.00pt;mso-wrap-distance-top:0.00pt;mso-wrap-distance-right:0.00pt;mso-wrap-distance-bottom:0.00pt;z-index:1;" stroked="false">
+                <v:imagedata r:id="rId27" o:title=""/>
+                <o:lock v:ext="edit" rotation="t"/>
+              </v:shape>
+            </w:pict>
+          </mc:Fallback>
+        </mc:AlternateContent>
+        <mc:AlternateContent>
+          <mc:Choice Requires="wpg">
+            <w:drawing>
+              <wp:inline xmlns:wp="http://schemas.openxmlformats.org/drawingml/2006/wordprocessingDrawing" distT="0" distB="0" distL="0" distR="0">
+                <wp:extent cx="5943600" cy="6166833"/>
+                <wp:effectExtent l="0" t="0" r="0" b="0"/>
+                <wp:docPr id="19" name=""/>
+                <wp:cNvGraphicFramePr>
+                  <a:graphicFrameLocks xmlns:a="http://schemas.openxmlformats.org/drawingml/2006/main" noChangeAspect="1"/>
+                </wp:cNvGraphicFramePr>
+                <a:graphic xmlns:a="http://schemas.openxmlformats.org/drawingml/2006/main">
+                  <a:graphicData uri="http://schemas.openxmlformats.org/drawingml/2006/picture">
+                    <pic:pic xmlns:pic="http://schemas.openxmlformats.org/drawingml/2006/picture">
+                      <pic:nvPicPr>
+                        <pic:cNvPr id="396935210" name=""/>
+                        <pic:cNvPicPr>
+                          <a:picLocks noChangeAspect="1"/>
+                        </pic:cNvPicPr>
+                        <pic:nvPr/>
+                      </pic:nvPicPr>
+                      <pic:blipFill rotWithShape="1">
+                        <a:blip r:embed="rId28"/>
+                        <a:stretch/>
+                      </pic:blipFill>
+                      <pic:spPr bwMode="auto">
+                        <a:xfrm>
+                          <a:off x="0" y="0"/>
+                          <a:ext cx="5943599" cy="6166833"/>
+                        </a:xfrm>
+                        <a:prstGeom prst="rect">
+                          <a:avLst/>
+                        </a:prstGeom>
+                      </pic:spPr>
+                    </pic:pic>
+                  </a:graphicData>
+                </a:graphic>
+              </wp:inline>
+            </w:drawing>
+          </mc:Choice>
+          <mc:Fallback>
+            <w:pict>
+              <v:shapetype id="_x0000_t75" coordsize="21600,21600" o:spt="75" o:preferrelative="t" path="m@4@5l@4@11@9@11@9@5xe" filled="f" stroked="f">
+                <v:stroke joinstyle="miter"/>
+                <v:formulas>
+                  <v:f eqn="if lineDrawn pixelLineWidth 0"/>
+                  <v:f eqn="sum @0 1 0"/>
+                  <v:f eqn="sum 0 0 @1"/>
+                  <v:f eqn="prod @2 1 2"/>
+                  <v:f eqn="prod @3 21600 pixelWidth"/>
+                  <v:f eqn="prod @3 21600 pixelHeight"/>
+                  <v:f eqn="sum @0 0 1"/>
+                  <v:f eqn="prod @6 1 2"/>
+                  <v:f eqn="prod @7 21600 pixelWidth"/>
+                  <v:f eqn="sum @8 21600 0"/>
+                  <v:f eqn="prod @7 21600 pixelHeight"/>
+                  <v:f eqn="sum @10 21600 0"/>
+                </v:formulas>
+                <v:path o:extrusionok="f" gradientshapeok="t" o:connecttype="rect"/>
+                <o:lock v:ext="edit" aspectratio="t"/>
+              </v:shapetype>
+              <v:shape id="_x0000_i18" o:spid="_x0000_s18" type="#_x0000_t75" style="width:468.00pt;height:485.58pt;mso-wrap-distance-left:0.00pt;mso-wrap-distance-top:0.00pt;mso-wrap-distance-right:0.00pt;mso-wrap-distance-bottom:0.00pt;z-index:1;" stroked="false">
+                <v:imagedata r:id="rId28" o:title=""/>
+                <o:lock v:ext="edit" rotation="t"/>
+              </v:shape>
+            </w:pict>
+          </mc:Fallback>
+        </mc:AlternateContent>
+      </w:r>
+      <w:r>
+        <w:rPr>
+          <w:highlight w:val="none"/>
+        </w:rPr>
+      </w:r>
+      <w:r>
+        <w:rPr>
+          <w:highlight w:val="none"/>
+        </w:rPr>
+      </w:r>
+      <w:r>
+        <w:rPr>
+          <w:highlight w:val="none"/>
+        </w:rPr>
+      </w:r>
+      <w:r>
+        <w:rPr>
+          <w:highlight w:val="none"/>
+        </w:rPr>
+        <mc:AlternateContent>
+          <mc:Choice Requires="wpg">
+            <w:drawing>
+              <wp:inline xmlns:wp="http://schemas.openxmlformats.org/drawingml/2006/wordprocessingDrawing" distT="0" distB="0" distL="0" distR="0">
+                <wp:extent cx="2552700" cy="3733800"/>
+                <wp:effectExtent l="0" t="0" r="0" b="0"/>
+                <wp:docPr id="20" name=""/>
+                <wp:cNvGraphicFramePr>
+                  <a:graphicFrameLocks xmlns:a="http://schemas.openxmlformats.org/drawingml/2006/main" noChangeAspect="1"/>
+                </wp:cNvGraphicFramePr>
+                <a:graphic xmlns:a="http://schemas.openxmlformats.org/drawingml/2006/main">
+                  <a:graphicData uri="http://schemas.openxmlformats.org/drawingml/2006/picture">
+                    <pic:pic xmlns:pic="http://schemas.openxmlformats.org/drawingml/2006/picture">
+                      <pic:nvPicPr>
+                        <pic:cNvPr id="1349417072" name=""/>
+                        <pic:cNvPicPr>
+                          <a:picLocks noChangeAspect="1"/>
+                        </pic:cNvPicPr>
+                        <pic:nvPr/>
+                      </pic:nvPicPr>
+                      <pic:blipFill rotWithShape="1">
+                        <a:blip r:embed="rId29"/>
+                        <a:stretch/>
+                      </pic:blipFill>
+                      <pic:spPr bwMode="auto">
+                        <a:xfrm>
+                          <a:off x="0" y="0"/>
+                          <a:ext cx="2552699" cy="3733799"/>
+                        </a:xfrm>
+                        <a:prstGeom prst="rect">
+                          <a:avLst/>
+                        </a:prstGeom>
+                      </pic:spPr>
+                    </pic:pic>
+                  </a:graphicData>
+                </a:graphic>
+              </wp:inline>
+            </w:drawing>
+          </mc:Choice>
+          <mc:Fallback>
+            <w:pict>
+              <v:shapetype id="_x0000_t75" coordsize="21600,21600" o:spt="75" o:preferrelative="t" path="m@4@5l@4@11@9@11@9@5xe" filled="f" stroked="f">
+                <v:stroke joinstyle="miter"/>
+                <v:formulas>
+                  <v:f eqn="if lineDrawn pixelLineWidth 0"/>
+                  <v:f eqn="sum @0 1 0"/>
+                  <v:f eqn="sum 0 0 @1"/>
+                  <v:f eqn="prod @2 1 2"/>
+                  <v:f eqn="prod @3 21600 pixelWidth"/>
+                  <v:f eqn="prod @3 21600 pixelHeight"/>
+                  <v:f eqn="sum @0 0 1"/>
+                  <v:f eqn="prod @6 1 2"/>
+                  <v:f eqn="prod @7 21600 pixelWidth"/>
+                  <v:f eqn="sum @8 21600 0"/>
+                  <v:f eqn="prod @7 21600 pixelHeight"/>
+                  <v:f eqn="sum @10 21600 0"/>
+                </v:formulas>
+                <v:path o:extrusionok="f" gradientshapeok="t" o:connecttype="rect"/>
+                <o:lock v:ext="edit" aspectratio="t"/>
+              </v:shapetype>
+              <v:shape id="_x0000_i19" o:spid="_x0000_s19" type="#_x0000_t75" style="width:201.00pt;height:294.00pt;mso-wrap-distance-left:0.00pt;mso-wrap-distance-top:0.00pt;mso-wrap-distance-right:0.00pt;mso-wrap-distance-bottom:0.00pt;z-index:1;" stroked="false">
+                <v:imagedata r:id="rId29" o:title=""/>
+                <o:lock v:ext="edit" rotation="t"/>
+              </v:shape>
+            </w:pict>
+          </mc:Fallback>
+        </mc:AlternateContent>
+      </w:r>
+      <w:r>
+        <w:rPr>
+          <w:highlight w:val="none"/>
+        </w:rPr>
+      </w:r>
+    </w:p>
+    <w:p>
+      <w:pPr>
+        <w:pBdr/>
+        <w:spacing/>
+        <w:ind/>
+        <w:rPr>
+          <w:rFonts w:ascii="Arial" w:hAnsi="Arial" w:cs="Arial"/>
+          <w:b w:val="0"/>
+          <w:bCs w:val="0"/>
+          <w:i w:val="0"/>
+          <w:caps w:val="0"/>
+          <w:smallCaps w:val="0"/>
+          <w:strike w:val="0"/>
+          <w:color w:val="000000" w:themeColor="text1"/>
+          <w:spacing w:val="0"/>
+          <w:sz w:val="38"/>
+          <w:szCs w:val="38"/>
+          <w:u w:val="none"/>
+          <w:lang w:val="en-US"/>
+        </w:rPr>
+      </w:pPr>
+      <w:r>
+        <w:rPr>
           <w:highlight w:val="none"/>
         </w:rPr>
         <w:t xml:space="preserve"> </w:t>
@@ -1051,7 +4048,7 @@
               <wp:inline xmlns:wp="http://schemas.openxmlformats.org/drawingml/2006/wordprocessingDrawing" distT="0" distB="0" distL="0" distR="0">
                 <wp:extent cx="5943600" cy="3585112"/>
                 <wp:effectExtent l="0" t="0" r="0" b="0"/>
-                <wp:docPr id="1" name=""/>
+                <wp:docPr id="21" name=""/>
                 <wp:cNvGraphicFramePr>
                   <a:graphicFrameLocks xmlns:a="http://schemas.openxmlformats.org/drawingml/2006/main" noChangeAspect="1"/>
                 </wp:cNvGraphicFramePr>
@@ -1059,14 +4056,14 @@
                   <a:graphicData uri="http://schemas.openxmlformats.org/drawingml/2006/picture">
                     <pic:pic xmlns:pic="http://schemas.openxmlformats.org/drawingml/2006/picture">
                       <pic:nvPicPr>
-                        <pic:cNvPr id="650186329" name=""/>
+                        <pic:cNvPr id="136522235" name=""/>
                         <pic:cNvPicPr>
                           <a:picLocks noChangeAspect="1"/>
                         </pic:cNvPicPr>
                         <pic:nvPr/>
                       </pic:nvPicPr>
                       <pic:blipFill rotWithShape="1">
-                        <a:blip r:embed="rId10"/>
+                        <a:blip r:embed="rId30"/>
                         <a:stretch/>
                       </pic:blipFill>
                       <pic:spPr bwMode="auto">
@@ -1105,8 +4102,8 @@
                 <v:path o:extrusionok="f" gradientshapeok="t" o:connecttype="rect"/>
                 <o:lock v:ext="edit" aspectratio="t"/>
               </v:shapetype>
-              <v:shape id="_x0000_i0" o:spid="_x0000_s0" type="#_x0000_t75" style="width:468.00pt;height:282.29pt;mso-wrap-distance-left:0.00pt;mso-wrap-distance-top:0.00pt;mso-wrap-distance-right:0.00pt;mso-wrap-distance-bottom:0.00pt;z-index:1;" stroked="false">
-                <v:imagedata r:id="rId10" o:title=""/>
+              <v:shape id="_x0000_i20" o:spid="_x0000_s20" type="#_x0000_t75" style="width:468.00pt;height:282.29pt;mso-wrap-distance-left:0.00pt;mso-wrap-distance-top:0.00pt;mso-wrap-distance-right:0.00pt;mso-wrap-distance-bottom:0.00pt;z-index:1;" stroked="false">
+                <v:imagedata r:id="rId30" o:title=""/>
                 <o:lock v:ext="edit" rotation="t"/>
               </v:shape>
             </w:pict>
@@ -1115,14 +4112,22 @@
       </w:r>
       <w:r>
         <w:rPr>
-          <w:highlight w:val="none"/>
+          <w:rFonts w:ascii="Arial" w:hAnsi="Arial" w:cs="Arial"/>
+          <w:b w:val="0"/>
+          <w:bCs w:val="0"/>
+          <w:i w:val="0"/>
+          <w:caps w:val="0"/>
+          <w:smallCaps w:val="0"/>
+          <w:strike w:val="0"/>
+          <w:color w:val="000000" w:themeColor="text1"/>
+          <w:spacing w:val="0"/>
+          <w:sz w:val="38"/>
+          <w:szCs w:val="38"/>
+          <w:u w:val="none"/>
+          <w:lang w:val="en-US"/>
         </w:rPr>
       </w:r>
-      <w:r>
-        <w:rPr>
-          <w:highlight w:val="none"/>
-        </w:rPr>
-      </w:r>
+      <w:r/>
     </w:p>
     <w:sectPr>
       <w:headerReference w:type="default" r:id="rId9"/>
@@ -1960,6 +4965,300 @@
       <w:suff w:val="tab"/>
     </w:lvl>
   </w:abstractNum>
+  <w:abstractNum w:abstractNumId="5">
+    <w:nsid w:val="21FF59B8"/>
+    <w:lvl w:ilvl="0">
+      <w:isLgl w:val="false"/>
+      <w:lvlJc w:val="left"/>
+      <w:lvlText w:val="–"/>
+      <w:numFmt w:val="bullet"/>
+      <w:pPr>
+        <w:pBdr/>
+        <w:spacing/>
+        <w:ind w:hanging="360" w:left="709"/>
+      </w:pPr>
+      <w:rPr>
+        <w:rFonts w:hint="default" w:ascii="Arial" w:hAnsi="Arial" w:eastAsia="Arial" w:cs="Arial"/>
+      </w:rPr>
+      <w:start w:val="1"/>
+      <w:suff w:val="tab"/>
+    </w:lvl>
+    <w:lvl w:ilvl="1">
+      <w:isLgl w:val="false"/>
+      <w:lvlJc w:val="left"/>
+      <w:lvlText w:val="o"/>
+      <w:numFmt w:val="bullet"/>
+      <w:pPr>
+        <w:pBdr/>
+        <w:spacing/>
+        <w:ind w:hanging="360" w:left="1429"/>
+      </w:pPr>
+      <w:rPr>
+        <w:rFonts w:hint="default" w:ascii="Courier New" w:hAnsi="Courier New" w:eastAsia="Courier New" w:cs="Courier New"/>
+      </w:rPr>
+      <w:start w:val="1"/>
+      <w:suff w:val="tab"/>
+    </w:lvl>
+    <w:lvl w:ilvl="2">
+      <w:isLgl w:val="false"/>
+      <w:lvlJc w:val="left"/>
+      <w:lvlText w:val="§"/>
+      <w:numFmt w:val="bullet"/>
+      <w:pPr>
+        <w:pBdr/>
+        <w:spacing/>
+        <w:ind w:hanging="360" w:left="2149"/>
+      </w:pPr>
+      <w:rPr>
+        <w:rFonts w:hint="default" w:ascii="Wingdings" w:hAnsi="Wingdings" w:eastAsia="Wingdings" w:cs="Wingdings"/>
+      </w:rPr>
+      <w:start w:val="1"/>
+      <w:suff w:val="tab"/>
+    </w:lvl>
+    <w:lvl w:ilvl="3">
+      <w:isLgl w:val="false"/>
+      <w:lvlJc w:val="left"/>
+      <w:lvlText w:val="·"/>
+      <w:numFmt w:val="bullet"/>
+      <w:pPr>
+        <w:pBdr/>
+        <w:spacing/>
+        <w:ind w:hanging="360" w:left="2869"/>
+      </w:pPr>
+      <w:rPr>
+        <w:rFonts w:hint="default" w:ascii="Symbol" w:hAnsi="Symbol" w:eastAsia="Symbol" w:cs="Symbol"/>
+      </w:rPr>
+      <w:start w:val="1"/>
+      <w:suff w:val="tab"/>
+    </w:lvl>
+    <w:lvl w:ilvl="4">
+      <w:isLgl w:val="false"/>
+      <w:lvlJc w:val="left"/>
+      <w:lvlText w:val="o"/>
+      <w:numFmt w:val="bullet"/>
+      <w:pPr>
+        <w:pBdr/>
+        <w:spacing/>
+        <w:ind w:hanging="360" w:left="3589"/>
+      </w:pPr>
+      <w:rPr>
+        <w:rFonts w:hint="default" w:ascii="Courier New" w:hAnsi="Courier New" w:eastAsia="Courier New" w:cs="Courier New"/>
+      </w:rPr>
+      <w:start w:val="1"/>
+      <w:suff w:val="tab"/>
+    </w:lvl>
+    <w:lvl w:ilvl="5">
+      <w:isLgl w:val="false"/>
+      <w:lvlJc w:val="left"/>
+      <w:lvlText w:val="§"/>
+      <w:numFmt w:val="bullet"/>
+      <w:pPr>
+        <w:pBdr/>
+        <w:spacing/>
+        <w:ind w:hanging="360" w:left="4309"/>
+      </w:pPr>
+      <w:rPr>
+        <w:rFonts w:hint="default" w:ascii="Wingdings" w:hAnsi="Wingdings" w:eastAsia="Wingdings" w:cs="Wingdings"/>
+      </w:rPr>
+      <w:start w:val="1"/>
+      <w:suff w:val="tab"/>
+    </w:lvl>
+    <w:lvl w:ilvl="6">
+      <w:isLgl w:val="false"/>
+      <w:lvlJc w:val="left"/>
+      <w:lvlText w:val="·"/>
+      <w:numFmt w:val="bullet"/>
+      <w:pPr>
+        <w:pBdr/>
+        <w:spacing/>
+        <w:ind w:hanging="360" w:left="5029"/>
+      </w:pPr>
+      <w:rPr>
+        <w:rFonts w:hint="default" w:ascii="Symbol" w:hAnsi="Symbol" w:eastAsia="Symbol" w:cs="Symbol"/>
+      </w:rPr>
+      <w:start w:val="1"/>
+      <w:suff w:val="tab"/>
+    </w:lvl>
+    <w:lvl w:ilvl="7">
+      <w:isLgl w:val="false"/>
+      <w:lvlJc w:val="left"/>
+      <w:lvlText w:val="o"/>
+      <w:numFmt w:val="bullet"/>
+      <w:pPr>
+        <w:pBdr/>
+        <w:spacing/>
+        <w:ind w:hanging="360" w:left="5749"/>
+      </w:pPr>
+      <w:rPr>
+        <w:rFonts w:hint="default" w:ascii="Courier New" w:hAnsi="Courier New" w:eastAsia="Courier New" w:cs="Courier New"/>
+      </w:rPr>
+      <w:start w:val="1"/>
+      <w:suff w:val="tab"/>
+    </w:lvl>
+    <w:lvl w:ilvl="8">
+      <w:isLgl w:val="false"/>
+      <w:lvlJc w:val="left"/>
+      <w:lvlText w:val="§"/>
+      <w:numFmt w:val="bullet"/>
+      <w:pPr>
+        <w:pBdr/>
+        <w:spacing/>
+        <w:ind w:hanging="360" w:left="6469"/>
+      </w:pPr>
+      <w:rPr>
+        <w:rFonts w:hint="default" w:ascii="Wingdings" w:hAnsi="Wingdings" w:eastAsia="Wingdings" w:cs="Wingdings"/>
+      </w:rPr>
+      <w:start w:val="1"/>
+      <w:suff w:val="tab"/>
+    </w:lvl>
+  </w:abstractNum>
+  <w:abstractNum w:abstractNumId="6">
+    <w:nsid w:val="73DA980D"/>
+    <w:lvl w:ilvl="0">
+      <w:isLgl w:val="false"/>
+      <w:lvlJc w:val="left"/>
+      <w:lvlText w:val="–"/>
+      <w:numFmt w:val="bullet"/>
+      <w:pPr>
+        <w:pBdr/>
+        <w:spacing/>
+        <w:ind w:hanging="360" w:left="709"/>
+      </w:pPr>
+      <w:rPr>
+        <w:rFonts w:hint="default" w:ascii="Arial" w:hAnsi="Arial" w:eastAsia="Arial" w:cs="Arial"/>
+      </w:rPr>
+      <w:start w:val="1"/>
+      <w:suff w:val="tab"/>
+    </w:lvl>
+    <w:lvl w:ilvl="1">
+      <w:isLgl w:val="false"/>
+      <w:lvlJc w:val="left"/>
+      <w:lvlText w:val="o"/>
+      <w:numFmt w:val="bullet"/>
+      <w:pPr>
+        <w:pBdr/>
+        <w:spacing/>
+        <w:ind w:hanging="360" w:left="1429"/>
+      </w:pPr>
+      <w:rPr>
+        <w:rFonts w:hint="default" w:ascii="Courier New" w:hAnsi="Courier New" w:eastAsia="Courier New" w:cs="Courier New"/>
+      </w:rPr>
+      <w:start w:val="1"/>
+      <w:suff w:val="tab"/>
+    </w:lvl>
+    <w:lvl w:ilvl="2">
+      <w:isLgl w:val="false"/>
+      <w:lvlJc w:val="left"/>
+      <w:lvlText w:val="§"/>
+      <w:numFmt w:val="bullet"/>
+      <w:pPr>
+        <w:pBdr/>
+        <w:spacing/>
+        <w:ind w:hanging="360" w:left="2149"/>
+      </w:pPr>
+      <w:rPr>
+        <w:rFonts w:hint="default" w:ascii="Wingdings" w:hAnsi="Wingdings" w:eastAsia="Wingdings" w:cs="Wingdings"/>
+      </w:rPr>
+      <w:start w:val="1"/>
+      <w:suff w:val="tab"/>
+    </w:lvl>
+    <w:lvl w:ilvl="3">
+      <w:isLgl w:val="false"/>
+      <w:lvlJc w:val="left"/>
+      <w:lvlText w:val="·"/>
+      <w:numFmt w:val="bullet"/>
+      <w:pPr>
+        <w:pBdr/>
+        <w:spacing/>
+        <w:ind w:hanging="360" w:left="2869"/>
+      </w:pPr>
+      <w:rPr>
+        <w:rFonts w:hint="default" w:ascii="Symbol" w:hAnsi="Symbol" w:eastAsia="Symbol" w:cs="Symbol"/>
+      </w:rPr>
+      <w:start w:val="1"/>
+      <w:suff w:val="tab"/>
+    </w:lvl>
+    <w:lvl w:ilvl="4">
+      <w:isLgl w:val="false"/>
+      <w:lvlJc w:val="left"/>
+      <w:lvlText w:val="o"/>
+      <w:numFmt w:val="bullet"/>
+      <w:pPr>
+        <w:pBdr/>
+        <w:spacing/>
+        <w:ind w:hanging="360" w:left="3589"/>
+      </w:pPr>
+      <w:rPr>
+        <w:rFonts w:hint="default" w:ascii="Courier New" w:hAnsi="Courier New" w:eastAsia="Courier New" w:cs="Courier New"/>
+      </w:rPr>
+      <w:start w:val="1"/>
+      <w:suff w:val="tab"/>
+    </w:lvl>
+    <w:lvl w:ilvl="5">
+      <w:isLgl w:val="false"/>
+      <w:lvlJc w:val="left"/>
+      <w:lvlText w:val="§"/>
+      <w:numFmt w:val="bullet"/>
+      <w:pPr>
+        <w:pBdr/>
+        <w:spacing/>
+        <w:ind w:hanging="360" w:left="4309"/>
+      </w:pPr>
+      <w:rPr>
+        <w:rFonts w:hint="default" w:ascii="Wingdings" w:hAnsi="Wingdings" w:eastAsia="Wingdings" w:cs="Wingdings"/>
+      </w:rPr>
+      <w:start w:val="1"/>
+      <w:suff w:val="tab"/>
+    </w:lvl>
+    <w:lvl w:ilvl="6">
+      <w:isLgl w:val="false"/>
+      <w:lvlJc w:val="left"/>
+      <w:lvlText w:val="·"/>
+      <w:numFmt w:val="bullet"/>
+      <w:pPr>
+        <w:pBdr/>
+        <w:spacing/>
+        <w:ind w:hanging="360" w:left="5029"/>
+      </w:pPr>
+      <w:rPr>
+        <w:rFonts w:hint="default" w:ascii="Symbol" w:hAnsi="Symbol" w:eastAsia="Symbol" w:cs="Symbol"/>
+      </w:rPr>
+      <w:start w:val="1"/>
+      <w:suff w:val="tab"/>
+    </w:lvl>
+    <w:lvl w:ilvl="7">
+      <w:isLgl w:val="false"/>
+      <w:lvlJc w:val="left"/>
+      <w:lvlText w:val="o"/>
+      <w:numFmt w:val="bullet"/>
+      <w:pPr>
+        <w:pBdr/>
+        <w:spacing/>
+        <w:ind w:hanging="360" w:left="5749"/>
+      </w:pPr>
+      <w:rPr>
+        <w:rFonts w:hint="default" w:ascii="Courier New" w:hAnsi="Courier New" w:eastAsia="Courier New" w:cs="Courier New"/>
+      </w:rPr>
+      <w:start w:val="1"/>
+      <w:suff w:val="tab"/>
+    </w:lvl>
+    <w:lvl w:ilvl="8">
+      <w:isLgl w:val="false"/>
+      <w:lvlJc w:val="left"/>
+      <w:lvlText w:val="§"/>
+      <w:numFmt w:val="bullet"/>
+      <w:pPr>
+        <w:pBdr/>
+        <w:spacing/>
+        <w:ind w:hanging="360" w:left="6469"/>
+      </w:pPr>
+      <w:rPr>
+        <w:rFonts w:hint="default" w:ascii="Wingdings" w:hAnsi="Wingdings" w:eastAsia="Wingdings" w:cs="Wingdings"/>
+      </w:rPr>
+      <w:start w:val="1"/>
+      <w:suff w:val="tab"/>
+    </w:lvl>
+  </w:abstractNum>
   <w:num w:numId="1">
     <w:abstractNumId w:val="0"/>
   </w:num>
@@ -1974,6 +5273,12 @@
   </w:num>
   <w:num w:numId="5">
     <w:abstractNumId w:val="4"/>
+  </w:num>
+  <w:num w:numId="6">
+    <w:abstractNumId w:val="5"/>
+  </w:num>
+  <w:num w:numId="7">
+    <w:abstractNumId w:val="6"/>
   </w:num>
 </w:numbering>
 </file>

</xml_diff>